<commit_message>
Se agrega mi archivo diario de reflexion completo
</commit_message>
<xml_diff>
--- a/Fase 1/Individual/Hernandez_Johan_1.2_APT122_DiarioReflexionFase1.docx
+++ b/Fase 1/Individual/Hernandez_Johan_1.2_APT122_DiarioReflexionFase1.docx
@@ -1,6 +1,6 @@
 
 <file path=word/document.xml><?xml version="1.0" encoding="utf-8"?>
-<w:document xmlns:wpc="http://schemas.microsoft.com/office/word/2010/wordprocessingCanvas" xmlns:cx="http://schemas.microsoft.com/office/drawing/2014/chartex" xmlns:mc="http://schemas.openxmlformats.org/markup-compatibility/2006" xmlns:o="urn:schemas-microsoft-com:office:office" xmlns:r="http://schemas.openxmlformats.org/officeDocument/2006/relationships" xmlns:m="http://schemas.openxmlformats.org/officeDocument/2006/math" xmlns:v="urn:schemas-microsoft-com:vml" xmlns:wp14="http://schemas.microsoft.com/office/word/2010/wordprocessingDrawing" xmlns:wp="http://schemas.openxmlformats.org/drawingml/2006/wordprocessingDrawing" xmlns:w10="urn:schemas-microsoft-com:office:word" xmlns:w="http://schemas.openxmlformats.org/wordprocessingml/2006/main" xmlns:w14="http://schemas.microsoft.com/office/word/2010/wordml" xmlns:w15="http://schemas.microsoft.com/office/word/2012/wordml" xmlns:w16se="http://schemas.microsoft.com/office/word/2015/wordml/symex" xmlns:wpg="http://schemas.microsoft.com/office/word/2010/wordprocessingGroup" xmlns:wpi="http://schemas.microsoft.com/office/word/2010/wordprocessingInk" xmlns:wne="http://schemas.microsoft.com/office/word/2006/wordml" xmlns:wps="http://schemas.microsoft.com/office/word/2010/wordprocessingShape" mc:Ignorable="w14 w15 w16se wp14">
+<w:document xmlns:wpc="http://schemas.microsoft.com/office/word/2010/wordprocessingCanvas" xmlns:cx="http://schemas.microsoft.com/office/drawing/2014/chartex" xmlns:cx1="http://schemas.microsoft.com/office/drawing/2015/9/8/chartex" xmlns:cx2="http://schemas.microsoft.com/office/drawing/2015/10/21/chartex" xmlns:cx3="http://schemas.microsoft.com/office/drawing/2016/5/9/chartex" xmlns:cx4="http://schemas.microsoft.com/office/drawing/2016/5/10/chartex" xmlns:cx5="http://schemas.microsoft.com/office/drawing/2016/5/11/chartex" xmlns:cx6="http://schemas.microsoft.com/office/drawing/2016/5/12/chartex" xmlns:cx7="http://schemas.microsoft.com/office/drawing/2016/5/13/chartex" xmlns:cx8="http://schemas.microsoft.com/office/drawing/2016/5/14/chartex" xmlns:mc="http://schemas.openxmlformats.org/markup-compatibility/2006" xmlns:aink="http://schemas.microsoft.com/office/drawing/2016/ink" xmlns:am3d="http://schemas.microsoft.com/office/drawing/2017/model3d" xmlns:o="urn:schemas-microsoft-com:office:office" xmlns:oel="http://schemas.microsoft.com/office/2019/extlst" xmlns:r="http://schemas.openxmlformats.org/officeDocument/2006/relationships" xmlns:m="http://schemas.openxmlformats.org/officeDocument/2006/math" xmlns:v="urn:schemas-microsoft-com:vml" xmlns:wp14="http://schemas.microsoft.com/office/word/2010/wordprocessingDrawing" xmlns:wp="http://schemas.openxmlformats.org/drawingml/2006/wordprocessingDrawing" xmlns:w10="urn:schemas-microsoft-com:office:word" xmlns:w="http://schemas.openxmlformats.org/wordprocessingml/2006/main" xmlns:w14="http://schemas.microsoft.com/office/word/2010/wordml" xmlns:w15="http://schemas.microsoft.com/office/word/2012/wordml" xmlns:w16cei="http://schemas.microsoft.com/office/word/2026/wordml/cei" xmlns:w16cex="http://schemas.microsoft.com/office/word/2018/wordml/cex" xmlns:w16cid="http://schemas.microsoft.com/office/word/2016/wordml/cid" xmlns:w16="http://schemas.microsoft.com/office/word/2018/wordml" xmlns:w16du="http://schemas.microsoft.com/office/word/2023/wordml/word16du" xmlns:w16sdtdh="http://schemas.microsoft.com/office/word/2020/wordml/sdtdatahash" xmlns:w16sdtfl="http://schemas.microsoft.com/office/word/2024/wordml/sdtformatlock" xmlns:w16se="http://schemas.microsoft.com/office/word/2015/wordml/symex" xmlns:wpg="http://schemas.microsoft.com/office/word/2010/wordprocessingGroup" xmlns:wpi="http://schemas.microsoft.com/office/word/2010/wordprocessingInk" xmlns:wne="http://schemas.microsoft.com/office/word/2006/wordml" xmlns:wps="http://schemas.microsoft.com/office/word/2010/wordprocessingShape" mc:Ignorable="w14 w15 w16se w16cid w16 w16cex w16sdtdh w16sdtfl w16du wp14">
   <w:body>
     <w:p/>
     <w:tbl>
@@ -359,6 +359,15 @@
                 <w:szCs w:val="24"/>
               </w:rPr>
             </w:pPr>
+            <w:r>
+              <w:rPr>
+                <w:rFonts w:eastAsiaTheme="majorEastAsia"/>
+                <w:color w:val="767171" w:themeColor="background2" w:themeShade="80"/>
+                <w:sz w:val="24"/>
+                <w:szCs w:val="24"/>
+              </w:rPr>
+              <w:t>Los módulos de certificación que más disfruté y que se conectan con mis intereses profesionales fueron Arquitectura de Software, Programación de Software y los del área de datos, Inteligencia de Negocios y Análisis y Desarrollo de Modelos de Datos. De Programación y Arquitectura de Software me gustó construir soluciones completas y pensar cómo estructurar un sistema para que sea mantenible y escalable. De Inteligencia de Negocios y Modelos de Datos me atrajo transformar datos en información útil para la toma de decisiones. También valoré Calidad de Software y Análisis y Planificación de Requerimientos Informáticos, porque me dieron una mirada más rigurosa sobre cómo definir y asegurar un producto antes y durante su desarrollo.</w:t>
+            </w:r>
           </w:p>
           <w:p>
             <w:pPr>
@@ -451,6 +460,15 @@
                 <w:szCs w:val="24"/>
               </w:rPr>
             </w:pPr>
+            <w:r>
+              <w:rPr>
+                <w:rFonts w:eastAsiaTheme="majorEastAsia"/>
+                <w:color w:val="767171" w:themeColor="background2" w:themeShade="80"/>
+                <w:sz w:val="24"/>
+                <w:szCs w:val="24"/>
+              </w:rPr>
+              <w:t>Sí, considero que las certificaciones obtenidas tienen valor. Cada una acredita de forma verificable un conjunto de competencias concretas como programación, arquitectura, modelamiento de datos, inteligencia de negocios, calidad, requerimientos y gestión de proyectos que respaldan mi perfil frente a un empleador y complementan mi experiencia laboral como Analista de Soporte N2. Además, la certificación de Inglés Intermedio Alto suma un plus en un rubro donde gran parte de la documentación y la comunicación técnica es en ese idioma. Más que un documento, representan evidencia de que puedo aplicar esas competencias en contextos reales de trabajo.</w:t>
+            </w:r>
           </w:p>
           <w:p>
             <w:pPr>
@@ -641,7 +659,6 @@
                 <w:sz w:val="24"/>
                 <w:szCs w:val="24"/>
               </w:rPr>
-              <w:lastRenderedPageBreak/>
               <w:t xml:space="preserve">2. Revisa las competencias y unidades de competencias correspondientes a cada asignatura de la malla de tu carrera. Marca en </w:t>
             </w:r>
             <w:r>
@@ -784,6 +801,160 @@
                 <w:szCs w:val="24"/>
               </w:rPr>
             </w:pPr>
+            <w:r>
+              <w:rPr>
+                <w:rFonts w:eastAsiaTheme="majorEastAsia"/>
+                <w:color w:val="767171" w:themeColor="background2" w:themeShade="80"/>
+                <w:sz w:val="24"/>
+                <w:szCs w:val="24"/>
+              </w:rPr>
+              <w:t xml:space="preserve">Mis competencias más desarrolladas, y en las que me siento seguro aplicando, son la programación de software y el desarrollo </w:t>
+            </w:r>
+            <w:proofErr w:type="spellStart"/>
+            <w:r>
+              <w:rPr>
+                <w:rFonts w:eastAsiaTheme="majorEastAsia"/>
+                <w:color w:val="767171" w:themeColor="background2" w:themeShade="80"/>
+                <w:sz w:val="24"/>
+                <w:szCs w:val="24"/>
+              </w:rPr>
+              <w:t>backend</w:t>
+            </w:r>
+            <w:proofErr w:type="spellEnd"/>
+            <w:r>
+              <w:rPr>
+                <w:rFonts w:eastAsiaTheme="majorEastAsia"/>
+                <w:color w:val="767171" w:themeColor="background2" w:themeShade="80"/>
+                <w:sz w:val="24"/>
+                <w:szCs w:val="24"/>
+              </w:rPr>
+              <w:t xml:space="preserve"> y full-</w:t>
+            </w:r>
+            <w:proofErr w:type="spellStart"/>
+            <w:r>
+              <w:rPr>
+                <w:rFonts w:eastAsiaTheme="majorEastAsia"/>
+                <w:color w:val="767171" w:themeColor="background2" w:themeShade="80"/>
+                <w:sz w:val="24"/>
+                <w:szCs w:val="24"/>
+              </w:rPr>
+              <w:t>stack</w:t>
+            </w:r>
+            <w:proofErr w:type="spellEnd"/>
+            <w:r>
+              <w:rPr>
+                <w:rFonts w:eastAsiaTheme="majorEastAsia"/>
+                <w:color w:val="767171" w:themeColor="background2" w:themeShade="80"/>
+                <w:sz w:val="24"/>
+                <w:szCs w:val="24"/>
+              </w:rPr>
+              <w:t xml:space="preserve"> (</w:t>
+            </w:r>
+            <w:proofErr w:type="spellStart"/>
+            <w:r>
+              <w:rPr>
+                <w:rFonts w:eastAsiaTheme="majorEastAsia"/>
+                <w:color w:val="767171" w:themeColor="background2" w:themeShade="80"/>
+                <w:sz w:val="24"/>
+                <w:szCs w:val="24"/>
+              </w:rPr>
+              <w:t>React</w:t>
+            </w:r>
+            <w:proofErr w:type="spellEnd"/>
+            <w:r>
+              <w:rPr>
+                <w:rFonts w:eastAsiaTheme="majorEastAsia"/>
+                <w:color w:val="767171" w:themeColor="background2" w:themeShade="80"/>
+                <w:sz w:val="24"/>
+                <w:szCs w:val="24"/>
+              </w:rPr>
+              <w:t xml:space="preserve">, Node.js, </w:t>
+            </w:r>
+            <w:proofErr w:type="spellStart"/>
+            <w:r>
+              <w:rPr>
+                <w:rFonts w:eastAsiaTheme="majorEastAsia"/>
+                <w:color w:val="767171" w:themeColor="background2" w:themeShade="80"/>
+                <w:sz w:val="24"/>
+                <w:szCs w:val="24"/>
+              </w:rPr>
+              <w:t>FastAPI</w:t>
+            </w:r>
+            <w:proofErr w:type="spellEnd"/>
+            <w:r>
+              <w:rPr>
+                <w:rFonts w:eastAsiaTheme="majorEastAsia"/>
+                <w:color w:val="767171" w:themeColor="background2" w:themeShade="80"/>
+                <w:sz w:val="24"/>
+                <w:szCs w:val="24"/>
+              </w:rPr>
+              <w:t>, PostgreSQL), el análisis y resolución de incidentes técnicos, la gestión y consulta de bases de datos (SQL en entornos productivos) y el modelamiento de datos, además de la administración de servidores Linux y la lectura de logs en arquitecturas de microservicios (Kafka, colas de mensajería). Mi trabajo diario como Soporte N2 refuerza constantemente estas habilidades.</w:t>
+            </w:r>
+          </w:p>
+          <w:p>
+            <w:pPr>
+              <w:tabs>
+                <w:tab w:val="left" w:pos="454"/>
+              </w:tabs>
+              <w:jc w:val="both"/>
+              <w:rPr>
+                <w:rFonts w:eastAsiaTheme="majorEastAsia"/>
+                <w:color w:val="767171" w:themeColor="background2" w:themeShade="80"/>
+                <w:sz w:val="24"/>
+                <w:szCs w:val="24"/>
+              </w:rPr>
+            </w:pPr>
+          </w:p>
+          <w:p>
+            <w:pPr>
+              <w:tabs>
+                <w:tab w:val="left" w:pos="454"/>
+              </w:tabs>
+              <w:jc w:val="both"/>
+              <w:rPr>
+                <w:rFonts w:eastAsiaTheme="majorEastAsia"/>
+                <w:color w:val="767171" w:themeColor="background2" w:themeShade="80"/>
+                <w:sz w:val="24"/>
+                <w:szCs w:val="24"/>
+              </w:rPr>
+            </w:pPr>
+          </w:p>
+          <w:p>
+            <w:pPr>
+              <w:tabs>
+                <w:tab w:val="left" w:pos="454"/>
+              </w:tabs>
+              <w:jc w:val="both"/>
+              <w:rPr>
+                <w:rFonts w:eastAsiaTheme="majorEastAsia"/>
+                <w:color w:val="767171" w:themeColor="background2" w:themeShade="80"/>
+                <w:sz w:val="24"/>
+                <w:szCs w:val="24"/>
+              </w:rPr>
+            </w:pPr>
+          </w:p>
+          <w:p>
+            <w:pPr>
+              <w:tabs>
+                <w:tab w:val="left" w:pos="454"/>
+              </w:tabs>
+              <w:jc w:val="both"/>
+              <w:rPr>
+                <w:rFonts w:eastAsiaTheme="majorEastAsia"/>
+                <w:color w:val="767171" w:themeColor="background2" w:themeShade="80"/>
+                <w:sz w:val="24"/>
+                <w:szCs w:val="24"/>
+              </w:rPr>
+            </w:pPr>
+            <w:r>
+              <w:rPr>
+                <w:rFonts w:eastAsiaTheme="majorEastAsia"/>
+                <w:color w:val="767171" w:themeColor="background2" w:themeShade="80"/>
+                <w:sz w:val="24"/>
+                <w:szCs w:val="24"/>
+              </w:rPr>
+              <w:t>Las competencias que siento que debo fortalecer son el diseño de arquitectura de sistemas distribuidos a gran escala tengo la base de la certificación en Arquitectura de Software, pero quiero llevarla a un nivel más autónomo, las prácticas de DevOps y despliegue continuo (CI/CD, contenedores y orquestación) y el liderazgo de equipos. Son áreas en las que ya tengo fundamentos, pero que quiero profundizar en la práctica profesional.</w:t>
+            </w:r>
           </w:p>
           <w:p>
             <w:pPr>
@@ -1242,6 +1413,35 @@
                 <w:szCs w:val="24"/>
               </w:rPr>
             </w:pPr>
+            <w:r>
+              <w:rPr>
+                <w:rFonts w:eastAsiaTheme="majorEastAsia"/>
+                <w:color w:val="767171" w:themeColor="background2" w:themeShade="80"/>
+                <w:sz w:val="24"/>
+                <w:szCs w:val="24"/>
+              </w:rPr>
+              <w:t xml:space="preserve">Mis principales intereses profesionales están en la ingeniería de software con foco en </w:t>
+            </w:r>
+            <w:proofErr w:type="spellStart"/>
+            <w:r>
+              <w:rPr>
+                <w:rFonts w:eastAsiaTheme="majorEastAsia"/>
+                <w:color w:val="767171" w:themeColor="background2" w:themeShade="80"/>
+                <w:sz w:val="24"/>
+                <w:szCs w:val="24"/>
+              </w:rPr>
+              <w:t>backend</w:t>
+            </w:r>
+            <w:proofErr w:type="spellEnd"/>
+            <w:r>
+              <w:rPr>
+                <w:rFonts w:eastAsiaTheme="majorEastAsia"/>
+                <w:color w:val="767171" w:themeColor="background2" w:themeShade="80"/>
+                <w:sz w:val="24"/>
+                <w:szCs w:val="24"/>
+              </w:rPr>
+              <w:t>, la ingeniería de datos y la arquitectura de plataformas. El área que más me interesa es el desarrollo y soporte de plataformas tecnológicas escalables, donde pueda combinar la resolución de problemas técnicos con el diseño de soluciones que funcionen en producción.</w:t>
+            </w:r>
           </w:p>
           <w:p>
             <w:pPr>
@@ -1410,6 +1610,35 @@
                 <w:szCs w:val="24"/>
               </w:rPr>
             </w:pPr>
+            <w:r>
+              <w:rPr>
+                <w:rFonts w:eastAsiaTheme="majorEastAsia"/>
+                <w:color w:val="767171" w:themeColor="background2" w:themeShade="80"/>
+                <w:sz w:val="24"/>
+                <w:szCs w:val="24"/>
+              </w:rPr>
+              <w:t xml:space="preserve">Las competencias que más se relacionan con esos intereses son la programación de software, la arquitectura de software, la gestión y modelamiento de bases de datos y la inteligencia de negocios. De ellas, la que siento que requiero fortalecer especialmente es el diseño de arquitecturas escalables y las prácticas de </w:t>
+            </w:r>
+            <w:proofErr w:type="spellStart"/>
+            <w:r>
+              <w:rPr>
+                <w:rFonts w:eastAsiaTheme="majorEastAsia"/>
+                <w:color w:val="767171" w:themeColor="background2" w:themeShade="80"/>
+                <w:sz w:val="24"/>
+                <w:szCs w:val="24"/>
+              </w:rPr>
+              <w:t>cloud</w:t>
+            </w:r>
+            <w:proofErr w:type="spellEnd"/>
+            <w:r>
+              <w:rPr>
+                <w:rFonts w:eastAsiaTheme="majorEastAsia"/>
+                <w:color w:val="767171" w:themeColor="background2" w:themeShade="80"/>
+                <w:sz w:val="24"/>
+                <w:szCs w:val="24"/>
+              </w:rPr>
+              <w:t>/DevOps, para no solo mantener sistemas, sino diseñarlos e implementarlos por completo.</w:t>
+            </w:r>
           </w:p>
           <w:p>
             <w:pPr>
@@ -1522,6 +1751,15 @@
                 <w:szCs w:val="24"/>
               </w:rPr>
             </w:pPr>
+            <w:r>
+              <w:rPr>
+                <w:rFonts w:eastAsiaTheme="majorEastAsia"/>
+                <w:color w:val="767171" w:themeColor="background2" w:themeShade="80"/>
+                <w:sz w:val="24"/>
+                <w:szCs w:val="24"/>
+              </w:rPr>
+              <w:t>En 5 años me gustaría desempeñarme como ingeniero de software senior o arquitecto de soluciones, o bien liderando técnicamente mis propios proyectos y emprendimientos. Me gustaría estar diseñando e implementando plataformas desde cero, tomando decisiones de arquitectura y con la posibilidad de guiar a un equipo, combinando la parte técnica con una visión de producto.</w:t>
+            </w:r>
           </w:p>
           <w:p>
             <w:pPr>
@@ -1743,8 +1981,6 @@
                 <w:szCs w:val="20"/>
               </w:rPr>
             </w:pPr>
-            <w:bookmarkStart w:id="0" w:name="_GoBack"/>
-            <w:bookmarkEnd w:id="0"/>
             <w:r>
               <w:rPr>
                 <w:rFonts w:eastAsiaTheme="majorEastAsia"/>
@@ -1817,6 +2053,176 @@
                 <w:szCs w:val="24"/>
               </w:rPr>
             </w:pPr>
+            <w:r>
+              <w:rPr>
+                <w:rFonts w:eastAsiaTheme="majorEastAsia"/>
+                <w:color w:val="767171" w:themeColor="background2" w:themeShade="80"/>
+                <w:sz w:val="24"/>
+                <w:szCs w:val="24"/>
+              </w:rPr>
+              <w:t xml:space="preserve">Sí, el proyecto que desarrollo en APT </w:t>
+            </w:r>
+            <w:proofErr w:type="spellStart"/>
+            <w:r>
+              <w:rPr>
+                <w:rFonts w:eastAsiaTheme="majorEastAsia"/>
+                <w:color w:val="767171" w:themeColor="background2" w:themeShade="80"/>
+                <w:sz w:val="24"/>
+                <w:szCs w:val="24"/>
+              </w:rPr>
+              <w:t>SkateClub</w:t>
+            </w:r>
+            <w:proofErr w:type="spellEnd"/>
+            <w:r>
+              <w:rPr>
+                <w:rFonts w:eastAsiaTheme="majorEastAsia"/>
+                <w:color w:val="767171" w:themeColor="background2" w:themeShade="80"/>
+                <w:sz w:val="24"/>
+                <w:szCs w:val="24"/>
+              </w:rPr>
+              <w:t xml:space="preserve">, una aplicación social para </w:t>
+            </w:r>
+            <w:proofErr w:type="spellStart"/>
+            <w:r>
+              <w:rPr>
+                <w:rFonts w:eastAsiaTheme="majorEastAsia"/>
+                <w:color w:val="767171" w:themeColor="background2" w:themeShade="80"/>
+                <w:sz w:val="24"/>
+                <w:szCs w:val="24"/>
+              </w:rPr>
+              <w:t>skaters</w:t>
+            </w:r>
+            <w:proofErr w:type="spellEnd"/>
+            <w:r>
+              <w:rPr>
+                <w:rFonts w:eastAsiaTheme="majorEastAsia"/>
+                <w:color w:val="767171" w:themeColor="background2" w:themeShade="80"/>
+                <w:sz w:val="24"/>
+                <w:szCs w:val="24"/>
+              </w:rPr>
+              <w:t xml:space="preserve"> con mapa colaborativo de spots geolocalizados, red social y gamificación se relaciona directamente con mis proyecciones profesionales, y es el que más se relaciona. Integra desarrollo full-</w:t>
+            </w:r>
+            <w:proofErr w:type="spellStart"/>
+            <w:r>
+              <w:rPr>
+                <w:rFonts w:eastAsiaTheme="majorEastAsia"/>
+                <w:color w:val="767171" w:themeColor="background2" w:themeShade="80"/>
+                <w:sz w:val="24"/>
+                <w:szCs w:val="24"/>
+              </w:rPr>
+              <w:t>stack</w:t>
+            </w:r>
+            <w:proofErr w:type="spellEnd"/>
+            <w:r>
+              <w:rPr>
+                <w:rFonts w:eastAsiaTheme="majorEastAsia"/>
+                <w:color w:val="767171" w:themeColor="background2" w:themeShade="80"/>
+                <w:sz w:val="24"/>
+                <w:szCs w:val="24"/>
+              </w:rPr>
+              <w:t xml:space="preserve"> (</w:t>
+            </w:r>
+            <w:proofErr w:type="spellStart"/>
+            <w:r>
+              <w:rPr>
+                <w:rFonts w:eastAsiaTheme="majorEastAsia"/>
+                <w:color w:val="767171" w:themeColor="background2" w:themeShade="80"/>
+                <w:sz w:val="24"/>
+                <w:szCs w:val="24"/>
+              </w:rPr>
+              <w:t>Flutter</w:t>
+            </w:r>
+            <w:proofErr w:type="spellEnd"/>
+            <w:r>
+              <w:rPr>
+                <w:rFonts w:eastAsiaTheme="majorEastAsia"/>
+                <w:color w:val="767171" w:themeColor="background2" w:themeShade="80"/>
+                <w:sz w:val="24"/>
+                <w:szCs w:val="24"/>
+              </w:rPr>
+              <w:t xml:space="preserve"> en el </w:t>
+            </w:r>
+            <w:proofErr w:type="spellStart"/>
+            <w:r>
+              <w:rPr>
+                <w:rFonts w:eastAsiaTheme="majorEastAsia"/>
+                <w:color w:val="767171" w:themeColor="background2" w:themeShade="80"/>
+                <w:sz w:val="24"/>
+                <w:szCs w:val="24"/>
+              </w:rPr>
+              <w:t>frontend</w:t>
+            </w:r>
+            <w:proofErr w:type="spellEnd"/>
+            <w:r>
+              <w:rPr>
+                <w:rFonts w:eastAsiaTheme="majorEastAsia"/>
+                <w:color w:val="767171" w:themeColor="background2" w:themeShade="80"/>
+                <w:sz w:val="24"/>
+                <w:szCs w:val="24"/>
+              </w:rPr>
+              <w:t xml:space="preserve">; </w:t>
+            </w:r>
+            <w:proofErr w:type="spellStart"/>
+            <w:r>
+              <w:rPr>
+                <w:rFonts w:eastAsiaTheme="majorEastAsia"/>
+                <w:color w:val="767171" w:themeColor="background2" w:themeShade="80"/>
+                <w:sz w:val="24"/>
+                <w:szCs w:val="24"/>
+              </w:rPr>
+              <w:t>FastAPI</w:t>
+            </w:r>
+            <w:proofErr w:type="spellEnd"/>
+            <w:r>
+              <w:rPr>
+                <w:rFonts w:eastAsiaTheme="majorEastAsia"/>
+                <w:color w:val="767171" w:themeColor="background2" w:themeShade="80"/>
+                <w:sz w:val="24"/>
+                <w:szCs w:val="24"/>
+              </w:rPr>
+              <w:t xml:space="preserve"> y PostgreSQL en el </w:t>
+            </w:r>
+            <w:proofErr w:type="spellStart"/>
+            <w:r>
+              <w:rPr>
+                <w:rFonts w:eastAsiaTheme="majorEastAsia"/>
+                <w:color w:val="767171" w:themeColor="background2" w:themeShade="80"/>
+                <w:sz w:val="24"/>
+                <w:szCs w:val="24"/>
+              </w:rPr>
+              <w:t>backend</w:t>
+            </w:r>
+            <w:proofErr w:type="spellEnd"/>
+            <w:r>
+              <w:rPr>
+                <w:rFonts w:eastAsiaTheme="majorEastAsia"/>
+                <w:color w:val="767171" w:themeColor="background2" w:themeShade="80"/>
+                <w:sz w:val="24"/>
+                <w:szCs w:val="24"/>
+              </w:rPr>
+              <w:t xml:space="preserve">), despliegue en la nube y trabajo bajo marco Scrum, que </w:t>
+            </w:r>
+            <w:r>
+              <w:rPr>
+                <w:rFonts w:eastAsiaTheme="majorEastAsia"/>
+                <w:color w:val="767171" w:themeColor="background2" w:themeShade="80"/>
+                <w:sz w:val="24"/>
+                <w:szCs w:val="24"/>
+              </w:rPr>
+              <w:lastRenderedPageBreak/>
+              <w:t xml:space="preserve">es justamente hacia donde quiero proyectarme. Sí requiere ajuste: el producto se inició sin definir formalmente su alcance ni sus requisitos, por lo que la principal mejora es formalizar la ingeniería de requisitos, el alcance y la documentación técnica dentro del marco </w:t>
+            </w:r>
+            <w:proofErr w:type="spellStart"/>
+            <w:r>
+              <w:rPr>
+                <w:rFonts w:eastAsiaTheme="majorEastAsia"/>
+                <w:color w:val="767171" w:themeColor="background2" w:themeShade="80"/>
+                <w:sz w:val="24"/>
+                <w:szCs w:val="24"/>
+              </w:rPr>
+              <w:t>metodológ</w:t>
+            </w:r>
+            <w:proofErr w:type="spellEnd"/>
           </w:p>
           <w:p>
             <w:pPr>
@@ -2093,6 +2499,32 @@
                 <w:bCs/>
               </w:rPr>
             </w:pPr>
+            <w:r>
+              <w:rPr>
+                <w:rFonts w:ascii="Calibri" w:hAnsi="Calibri"/>
+                <w:b/>
+                <w:bCs/>
+              </w:rPr>
+              <w:t xml:space="preserve">Las áreas de desempeño y competencias que aborda este Proyecto APT son la programación de software, la arquitectura de software, el análisis y planificación de requerimientos, el modelamiento de bases de datos, la calidad de software y la gestión de proyectos informáticos varias de ellas coincidentes con mis certificaciones, además del despliegue en la nube (DevOps). El tipo de proyecto que más me ayuda en mi desarrollo profesional es precisamente este: una aplicación real, en producción y con una arquitectura definida, porque me obliga a combinar </w:t>
+            </w:r>
+            <w:proofErr w:type="spellStart"/>
+            <w:r>
+              <w:rPr>
+                <w:rFonts w:ascii="Calibri" w:hAnsi="Calibri"/>
+                <w:b/>
+                <w:bCs/>
+              </w:rPr>
+              <w:t>backend</w:t>
+            </w:r>
+            <w:proofErr w:type="spellEnd"/>
+            <w:r>
+              <w:rPr>
+                <w:rFonts w:ascii="Calibri" w:hAnsi="Calibri"/>
+                <w:b/>
+                <w:bCs/>
+              </w:rPr>
+              <w:t>, datos, despliegue y trabajo en equipo. El contexto en el que se sitúa es el de un producto digital real una plataforma social desarrollado de forma colaborativa bajo Scrum y desplegado en la nube.</w:t>
+            </w:r>
           </w:p>
           <w:p>
             <w:pPr>
@@ -2213,7 +2645,7 @@
 </file>
 
 <file path=word/endnotes.xml><?xml version="1.0" encoding="utf-8"?>
-<w:endnotes xmlns:wpc="http://schemas.microsoft.com/office/word/2010/wordprocessingCanvas" xmlns:cx="http://schemas.microsoft.com/office/drawing/2014/chartex" xmlns:mc="http://schemas.openxmlformats.org/markup-compatibility/2006" xmlns:o="urn:schemas-microsoft-com:office:office" xmlns:r="http://schemas.openxmlformats.org/officeDocument/2006/relationships" xmlns:m="http://schemas.openxmlformats.org/officeDocument/2006/math" xmlns:v="urn:schemas-microsoft-com:vml" xmlns:wp14="http://schemas.microsoft.com/office/word/2010/wordprocessingDrawing" xmlns:wp="http://schemas.openxmlformats.org/drawingml/2006/wordprocessingDrawing" xmlns:w10="urn:schemas-microsoft-com:office:word" xmlns:w="http://schemas.openxmlformats.org/wordprocessingml/2006/main" xmlns:w14="http://schemas.microsoft.com/office/word/2010/wordml" xmlns:w15="http://schemas.microsoft.com/office/word/2012/wordml" xmlns:w16se="http://schemas.microsoft.com/office/word/2015/wordml/symex" xmlns:wpg="http://schemas.microsoft.com/office/word/2010/wordprocessingGroup" xmlns:wpi="http://schemas.microsoft.com/office/word/2010/wordprocessingInk" xmlns:wne="http://schemas.microsoft.com/office/word/2006/wordml" xmlns:wps="http://schemas.microsoft.com/office/word/2010/wordprocessingShape" mc:Ignorable="w14 w15 w16se wp14">
+<w:endnotes xmlns:wpc="http://schemas.microsoft.com/office/word/2010/wordprocessingCanvas" xmlns:cx="http://schemas.microsoft.com/office/drawing/2014/chartex" xmlns:cx1="http://schemas.microsoft.com/office/drawing/2015/9/8/chartex" xmlns:cx2="http://schemas.microsoft.com/office/drawing/2015/10/21/chartex" xmlns:cx3="http://schemas.microsoft.com/office/drawing/2016/5/9/chartex" xmlns:cx4="http://schemas.microsoft.com/office/drawing/2016/5/10/chartex" xmlns:cx5="http://schemas.microsoft.com/office/drawing/2016/5/11/chartex" xmlns:cx6="http://schemas.microsoft.com/office/drawing/2016/5/12/chartex" xmlns:cx7="http://schemas.microsoft.com/office/drawing/2016/5/13/chartex" xmlns:cx8="http://schemas.microsoft.com/office/drawing/2016/5/14/chartex" xmlns:mc="http://schemas.openxmlformats.org/markup-compatibility/2006" xmlns:aink="http://schemas.microsoft.com/office/drawing/2016/ink" xmlns:am3d="http://schemas.microsoft.com/office/drawing/2017/model3d" xmlns:o="urn:schemas-microsoft-com:office:office" xmlns:oel="http://schemas.microsoft.com/office/2019/extlst" xmlns:r="http://schemas.openxmlformats.org/officeDocument/2006/relationships" xmlns:m="http://schemas.openxmlformats.org/officeDocument/2006/math" xmlns:v="urn:schemas-microsoft-com:vml" xmlns:wp14="http://schemas.microsoft.com/office/word/2010/wordprocessingDrawing" xmlns:wp="http://schemas.openxmlformats.org/drawingml/2006/wordprocessingDrawing" xmlns:w10="urn:schemas-microsoft-com:office:word" xmlns:w="http://schemas.openxmlformats.org/wordprocessingml/2006/main" xmlns:w14="http://schemas.microsoft.com/office/word/2010/wordml" xmlns:w15="http://schemas.microsoft.com/office/word/2012/wordml" xmlns:w16cei="http://schemas.microsoft.com/office/word/2026/wordml/cei" xmlns:w16cex="http://schemas.microsoft.com/office/word/2018/wordml/cex" xmlns:w16cid="http://schemas.microsoft.com/office/word/2016/wordml/cid" xmlns:w16="http://schemas.microsoft.com/office/word/2018/wordml" xmlns:w16du="http://schemas.microsoft.com/office/word/2023/wordml/word16du" xmlns:w16sdtdh="http://schemas.microsoft.com/office/word/2020/wordml/sdtdatahash" xmlns:w16sdtfl="http://schemas.microsoft.com/office/word/2024/wordml/sdtformatlock" xmlns:w16se="http://schemas.microsoft.com/office/word/2015/wordml/symex" xmlns:wpg="http://schemas.microsoft.com/office/word/2010/wordprocessingGroup" xmlns:wpi="http://schemas.microsoft.com/office/word/2010/wordprocessingInk" xmlns:wne="http://schemas.microsoft.com/office/word/2006/wordml" xmlns:wps="http://schemas.microsoft.com/office/word/2010/wordprocessingShape" mc:Ignorable="w14 w15 w16se w16cid w16 w16cex w16sdtdh w16sdtfl w16du wp14">
   <w:endnote w:type="separator" w:id="-1">
     <w:p>
       <w:pPr>
@@ -2238,7 +2670,7 @@
 </file>
 
 <file path=word/footer1.xml><?xml version="1.0" encoding="utf-8"?>
-<w:ftr xmlns:wpc="http://schemas.microsoft.com/office/word/2010/wordprocessingCanvas" xmlns:cx="http://schemas.microsoft.com/office/drawing/2014/chartex" xmlns:mc="http://schemas.openxmlformats.org/markup-compatibility/2006" xmlns:o="urn:schemas-microsoft-com:office:office" xmlns:r="http://schemas.openxmlformats.org/officeDocument/2006/relationships" xmlns:m="http://schemas.openxmlformats.org/officeDocument/2006/math" xmlns:v="urn:schemas-microsoft-com:vml" xmlns:wp14="http://schemas.microsoft.com/office/word/2010/wordprocessingDrawing" xmlns:wp="http://schemas.openxmlformats.org/drawingml/2006/wordprocessingDrawing" xmlns:w10="urn:schemas-microsoft-com:office:word" xmlns:w="http://schemas.openxmlformats.org/wordprocessingml/2006/main" xmlns:w14="http://schemas.microsoft.com/office/word/2010/wordml" xmlns:w15="http://schemas.microsoft.com/office/word/2012/wordml" xmlns:w16se="http://schemas.microsoft.com/office/word/2015/wordml/symex" xmlns:wpg="http://schemas.microsoft.com/office/word/2010/wordprocessingGroup" xmlns:wpi="http://schemas.microsoft.com/office/word/2010/wordprocessingInk" xmlns:wne="http://schemas.microsoft.com/office/word/2006/wordml" xmlns:wps="http://schemas.microsoft.com/office/word/2010/wordprocessingShape" mc:Ignorable="w14 w15 w16se wp14">
+<w:ftr xmlns:wpc="http://schemas.microsoft.com/office/word/2010/wordprocessingCanvas" xmlns:cx="http://schemas.microsoft.com/office/drawing/2014/chartex" xmlns:cx1="http://schemas.microsoft.com/office/drawing/2015/9/8/chartex" xmlns:cx2="http://schemas.microsoft.com/office/drawing/2015/10/21/chartex" xmlns:cx3="http://schemas.microsoft.com/office/drawing/2016/5/9/chartex" xmlns:cx4="http://schemas.microsoft.com/office/drawing/2016/5/10/chartex" xmlns:cx5="http://schemas.microsoft.com/office/drawing/2016/5/11/chartex" xmlns:cx6="http://schemas.microsoft.com/office/drawing/2016/5/12/chartex" xmlns:cx7="http://schemas.microsoft.com/office/drawing/2016/5/13/chartex" xmlns:cx8="http://schemas.microsoft.com/office/drawing/2016/5/14/chartex" xmlns:mc="http://schemas.openxmlformats.org/markup-compatibility/2006" xmlns:aink="http://schemas.microsoft.com/office/drawing/2016/ink" xmlns:am3d="http://schemas.microsoft.com/office/drawing/2017/model3d" xmlns:o="urn:schemas-microsoft-com:office:office" xmlns:oel="http://schemas.microsoft.com/office/2019/extlst" xmlns:r="http://schemas.openxmlformats.org/officeDocument/2006/relationships" xmlns:m="http://schemas.openxmlformats.org/officeDocument/2006/math" xmlns:v="urn:schemas-microsoft-com:vml" xmlns:wp14="http://schemas.microsoft.com/office/word/2010/wordprocessingDrawing" xmlns:wp="http://schemas.openxmlformats.org/drawingml/2006/wordprocessingDrawing" xmlns:w10="urn:schemas-microsoft-com:office:word" xmlns:w="http://schemas.openxmlformats.org/wordprocessingml/2006/main" xmlns:w14="http://schemas.microsoft.com/office/word/2010/wordml" xmlns:w15="http://schemas.microsoft.com/office/word/2012/wordml" xmlns:w16cei="http://schemas.microsoft.com/office/word/2026/wordml/cei" xmlns:w16cex="http://schemas.microsoft.com/office/word/2018/wordml/cex" xmlns:w16cid="http://schemas.microsoft.com/office/word/2016/wordml/cid" xmlns:w16="http://schemas.microsoft.com/office/word/2018/wordml" xmlns:w16du="http://schemas.microsoft.com/office/word/2023/wordml/word16du" xmlns:w16sdtdh="http://schemas.microsoft.com/office/word/2020/wordml/sdtdatahash" xmlns:w16sdtfl="http://schemas.microsoft.com/office/word/2024/wordml/sdtformatlock" xmlns:w16se="http://schemas.microsoft.com/office/word/2015/wordml/symex" xmlns:wpg="http://schemas.microsoft.com/office/word/2010/wordprocessingGroup" xmlns:wpi="http://schemas.microsoft.com/office/word/2010/wordprocessingInk" xmlns:wne="http://schemas.microsoft.com/office/word/2006/wordml" xmlns:wps="http://schemas.microsoft.com/office/word/2010/wordprocessingShape" mc:Ignorable="w14 w15 w16se w16cid w16 w16cex w16sdtdh w16sdtfl w16du wp14">
   <w:sdt>
     <w:sdtPr>
       <w:id w:val="-937982979"/>
@@ -2247,7 +2679,6 @@
         <w:docPartUnique/>
       </w:docPartObj>
     </w:sdtPr>
-    <w:sdtEndPr/>
     <w:sdtContent>
       <w:p>
         <w:pPr>
@@ -2459,7 +2890,7 @@
             </mc:Choice>
             <mc:Fallback>
               <w:pict>
-                <v:group w14:anchorId="51D00065" id="Grupo 32" o:spid="_x0000_s1026" style="position:absolute;margin-left:0;margin-top:0;width:610.5pt;height:15pt;z-index:251659264;mso-width-percent:1000;mso-position-horizontal:center;mso-position-horizontal-relative:page;mso-position-vertical:center;mso-position-vertical-relative:bottom-margin-area;mso-width-percent:1000" coordorigin=",14970" coordsize="12255,300" o:gfxdata="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">
+                <v:group w14:anchorId="51D00065" id="Grupo 32" o:spid="_x0000_s1026" style="position:absolute;margin-left:0;margin-top:0;width:610.5pt;height:15pt;z-index:251659264;mso-width-percent:1000;mso-position-horizontal:center;mso-position-horizontal-relative:page;mso-position-vertical:center;mso-position-vertical-relative:bottom-margin-area;mso-width-percent:1000" coordorigin=",14970" coordsize="12255,300" o:gfxdata="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">
                   <v:shapetype id="_x0000_t202" coordsize="21600,21600" o:spt="202" path="m,l,21600r21600,l21600,xe">
                     <v:stroke joinstyle="miter"/>
                     <v:path gradientshapeok="t" o:connecttype="rect"/>
@@ -2526,7 +2957,7 @@
 </file>
 
 <file path=word/footnotes.xml><?xml version="1.0" encoding="utf-8"?>
-<w:footnotes xmlns:wpc="http://schemas.microsoft.com/office/word/2010/wordprocessingCanvas" xmlns:cx="http://schemas.microsoft.com/office/drawing/2014/chartex" xmlns:mc="http://schemas.openxmlformats.org/markup-compatibility/2006" xmlns:o="urn:schemas-microsoft-com:office:office" xmlns:r="http://schemas.openxmlformats.org/officeDocument/2006/relationships" xmlns:m="http://schemas.openxmlformats.org/officeDocument/2006/math" xmlns:v="urn:schemas-microsoft-com:vml" xmlns:wp14="http://schemas.microsoft.com/office/word/2010/wordprocessingDrawing" xmlns:wp="http://schemas.openxmlformats.org/drawingml/2006/wordprocessingDrawing" xmlns:w10="urn:schemas-microsoft-com:office:word" xmlns:w="http://schemas.openxmlformats.org/wordprocessingml/2006/main" xmlns:w14="http://schemas.microsoft.com/office/word/2010/wordml" xmlns:w15="http://schemas.microsoft.com/office/word/2012/wordml" xmlns:w16se="http://schemas.microsoft.com/office/word/2015/wordml/symex" xmlns:wpg="http://schemas.microsoft.com/office/word/2010/wordprocessingGroup" xmlns:wpi="http://schemas.microsoft.com/office/word/2010/wordprocessingInk" xmlns:wne="http://schemas.microsoft.com/office/word/2006/wordml" xmlns:wps="http://schemas.microsoft.com/office/word/2010/wordprocessingShape" mc:Ignorable="w14 w15 w16se wp14">
+<w:footnotes xmlns:wpc="http://schemas.microsoft.com/office/word/2010/wordprocessingCanvas" xmlns:cx="http://schemas.microsoft.com/office/drawing/2014/chartex" xmlns:cx1="http://schemas.microsoft.com/office/drawing/2015/9/8/chartex" xmlns:cx2="http://schemas.microsoft.com/office/drawing/2015/10/21/chartex" xmlns:cx3="http://schemas.microsoft.com/office/drawing/2016/5/9/chartex" xmlns:cx4="http://schemas.microsoft.com/office/drawing/2016/5/10/chartex" xmlns:cx5="http://schemas.microsoft.com/office/drawing/2016/5/11/chartex" xmlns:cx6="http://schemas.microsoft.com/office/drawing/2016/5/12/chartex" xmlns:cx7="http://schemas.microsoft.com/office/drawing/2016/5/13/chartex" xmlns:cx8="http://schemas.microsoft.com/office/drawing/2016/5/14/chartex" xmlns:mc="http://schemas.openxmlformats.org/markup-compatibility/2006" xmlns:aink="http://schemas.microsoft.com/office/drawing/2016/ink" xmlns:am3d="http://schemas.microsoft.com/office/drawing/2017/model3d" xmlns:o="urn:schemas-microsoft-com:office:office" xmlns:oel="http://schemas.microsoft.com/office/2019/extlst" xmlns:r="http://schemas.openxmlformats.org/officeDocument/2006/relationships" xmlns:m="http://schemas.openxmlformats.org/officeDocument/2006/math" xmlns:v="urn:schemas-microsoft-com:vml" xmlns:wp14="http://schemas.microsoft.com/office/word/2010/wordprocessingDrawing" xmlns:wp="http://schemas.openxmlformats.org/drawingml/2006/wordprocessingDrawing" xmlns:w10="urn:schemas-microsoft-com:office:word" xmlns:w="http://schemas.openxmlformats.org/wordprocessingml/2006/main" xmlns:w14="http://schemas.microsoft.com/office/word/2010/wordml" xmlns:w15="http://schemas.microsoft.com/office/word/2012/wordml" xmlns:w16cei="http://schemas.microsoft.com/office/word/2026/wordml/cei" xmlns:w16cex="http://schemas.microsoft.com/office/word/2018/wordml/cex" xmlns:w16cid="http://schemas.microsoft.com/office/word/2016/wordml/cid" xmlns:w16="http://schemas.microsoft.com/office/word/2018/wordml" xmlns:w16du="http://schemas.microsoft.com/office/word/2023/wordml/word16du" xmlns:w16sdtdh="http://schemas.microsoft.com/office/word/2020/wordml/sdtdatahash" xmlns:w16sdtfl="http://schemas.microsoft.com/office/word/2024/wordml/sdtformatlock" xmlns:w16se="http://schemas.microsoft.com/office/word/2015/wordml/symex" xmlns:wpg="http://schemas.microsoft.com/office/word/2010/wordprocessingGroup" xmlns:wpi="http://schemas.microsoft.com/office/word/2010/wordprocessingInk" xmlns:wne="http://schemas.microsoft.com/office/word/2006/wordml" xmlns:wps="http://schemas.microsoft.com/office/word/2010/wordprocessingShape" mc:Ignorable="w14 w15 w16se w16cid w16 w16cex w16sdtdh w16sdtfl w16du wp14">
   <w:footnote w:type="separator" w:id="-1">
     <w:p>
       <w:pPr>
@@ -2551,7 +2982,7 @@
 </file>
 
 <file path=word/header1.xml><?xml version="1.0" encoding="utf-8"?>
-<w:hdr xmlns:wpc="http://schemas.microsoft.com/office/word/2010/wordprocessingCanvas" xmlns:cx="http://schemas.microsoft.com/office/drawing/2014/chartex" xmlns:mc="http://schemas.openxmlformats.org/markup-compatibility/2006" xmlns:o="urn:schemas-microsoft-com:office:office" xmlns:r="http://schemas.openxmlformats.org/officeDocument/2006/relationships" xmlns:m="http://schemas.openxmlformats.org/officeDocument/2006/math" xmlns:v="urn:schemas-microsoft-com:vml" xmlns:wp14="http://schemas.microsoft.com/office/word/2010/wordprocessingDrawing" xmlns:wp="http://schemas.openxmlformats.org/drawingml/2006/wordprocessingDrawing" xmlns:w10="urn:schemas-microsoft-com:office:word" xmlns:w="http://schemas.openxmlformats.org/wordprocessingml/2006/main" xmlns:w14="http://schemas.microsoft.com/office/word/2010/wordml" xmlns:w15="http://schemas.microsoft.com/office/word/2012/wordml" xmlns:w16se="http://schemas.microsoft.com/office/word/2015/wordml/symex" xmlns:wpg="http://schemas.microsoft.com/office/word/2010/wordprocessingGroup" xmlns:wpi="http://schemas.microsoft.com/office/word/2010/wordprocessingInk" xmlns:wne="http://schemas.microsoft.com/office/word/2006/wordml" xmlns:wps="http://schemas.microsoft.com/office/word/2010/wordprocessingShape" mc:Ignorable="w14 w15 w16se wp14">
+<w:hdr xmlns:wpc="http://schemas.microsoft.com/office/word/2010/wordprocessingCanvas" xmlns:cx="http://schemas.microsoft.com/office/drawing/2014/chartex" xmlns:cx1="http://schemas.microsoft.com/office/drawing/2015/9/8/chartex" xmlns:cx2="http://schemas.microsoft.com/office/drawing/2015/10/21/chartex" xmlns:cx3="http://schemas.microsoft.com/office/drawing/2016/5/9/chartex" xmlns:cx4="http://schemas.microsoft.com/office/drawing/2016/5/10/chartex" xmlns:cx5="http://schemas.microsoft.com/office/drawing/2016/5/11/chartex" xmlns:cx6="http://schemas.microsoft.com/office/drawing/2016/5/12/chartex" xmlns:cx7="http://schemas.microsoft.com/office/drawing/2016/5/13/chartex" xmlns:cx8="http://schemas.microsoft.com/office/drawing/2016/5/14/chartex" xmlns:mc="http://schemas.openxmlformats.org/markup-compatibility/2006" xmlns:aink="http://schemas.microsoft.com/office/drawing/2016/ink" xmlns:am3d="http://schemas.microsoft.com/office/drawing/2017/model3d" xmlns:o="urn:schemas-microsoft-com:office:office" xmlns:oel="http://schemas.microsoft.com/office/2019/extlst" xmlns:r="http://schemas.openxmlformats.org/officeDocument/2006/relationships" xmlns:m="http://schemas.openxmlformats.org/officeDocument/2006/math" xmlns:v="urn:schemas-microsoft-com:vml" xmlns:wp14="http://schemas.microsoft.com/office/word/2010/wordprocessingDrawing" xmlns:wp="http://schemas.openxmlformats.org/drawingml/2006/wordprocessingDrawing" xmlns:w10="urn:schemas-microsoft-com:office:word" xmlns:w="http://schemas.openxmlformats.org/wordprocessingml/2006/main" xmlns:w14="http://schemas.microsoft.com/office/word/2010/wordml" xmlns:w15="http://schemas.microsoft.com/office/word/2012/wordml" xmlns:w16cei="http://schemas.microsoft.com/office/word/2026/wordml/cei" xmlns:w16cex="http://schemas.microsoft.com/office/word/2018/wordml/cex" xmlns:w16cid="http://schemas.microsoft.com/office/word/2016/wordml/cid" xmlns:w16="http://schemas.microsoft.com/office/word/2018/wordml" xmlns:w16du="http://schemas.microsoft.com/office/word/2023/wordml/word16du" xmlns:w16sdtdh="http://schemas.microsoft.com/office/word/2020/wordml/sdtdatahash" xmlns:w16sdtfl="http://schemas.microsoft.com/office/word/2024/wordml/sdtformatlock" xmlns:w16se="http://schemas.microsoft.com/office/word/2015/wordml/symex" xmlns:wpg="http://schemas.microsoft.com/office/word/2010/wordprocessingGroup" xmlns:wpi="http://schemas.microsoft.com/office/word/2010/wordprocessingInk" xmlns:wne="http://schemas.microsoft.com/office/word/2006/wordml" xmlns:wps="http://schemas.microsoft.com/office/word/2010/wordprocessingShape" mc:Ignorable="w14 w15 w16se w16cid w16 w16cex w16sdtdh w16sdtfl w16du wp14">
   <w:tbl>
     <w:tblPr>
       <w:tblStyle w:val="Tablaconcuadrcula"/>
@@ -2721,7 +3152,7 @@
 </file>
 
 <file path=word/header2.xml><?xml version="1.0" encoding="utf-8"?>
-<w:hdr xmlns:wpc="http://schemas.microsoft.com/office/word/2010/wordprocessingCanvas" xmlns:cx="http://schemas.microsoft.com/office/drawing/2014/chartex" xmlns:mc="http://schemas.openxmlformats.org/markup-compatibility/2006" xmlns:o="urn:schemas-microsoft-com:office:office" xmlns:r="http://schemas.openxmlformats.org/officeDocument/2006/relationships" xmlns:m="http://schemas.openxmlformats.org/officeDocument/2006/math" xmlns:v="urn:schemas-microsoft-com:vml" xmlns:wp14="http://schemas.microsoft.com/office/word/2010/wordprocessingDrawing" xmlns:wp="http://schemas.openxmlformats.org/drawingml/2006/wordprocessingDrawing" xmlns:w10="urn:schemas-microsoft-com:office:word" xmlns:w="http://schemas.openxmlformats.org/wordprocessingml/2006/main" xmlns:w14="http://schemas.microsoft.com/office/word/2010/wordml" xmlns:w15="http://schemas.microsoft.com/office/word/2012/wordml" xmlns:w16se="http://schemas.microsoft.com/office/word/2015/wordml/symex" xmlns:wpg="http://schemas.microsoft.com/office/word/2010/wordprocessingGroup" xmlns:wpi="http://schemas.microsoft.com/office/word/2010/wordprocessingInk" xmlns:wne="http://schemas.microsoft.com/office/word/2006/wordml" xmlns:wps="http://schemas.microsoft.com/office/word/2010/wordprocessingShape" mc:Ignorable="w14 w15 w16se wp14">
+<w:hdr xmlns:wpc="http://schemas.microsoft.com/office/word/2010/wordprocessingCanvas" xmlns:cx="http://schemas.microsoft.com/office/drawing/2014/chartex" xmlns:cx1="http://schemas.microsoft.com/office/drawing/2015/9/8/chartex" xmlns:cx2="http://schemas.microsoft.com/office/drawing/2015/10/21/chartex" xmlns:cx3="http://schemas.microsoft.com/office/drawing/2016/5/9/chartex" xmlns:cx4="http://schemas.microsoft.com/office/drawing/2016/5/10/chartex" xmlns:cx5="http://schemas.microsoft.com/office/drawing/2016/5/11/chartex" xmlns:cx6="http://schemas.microsoft.com/office/drawing/2016/5/12/chartex" xmlns:cx7="http://schemas.microsoft.com/office/drawing/2016/5/13/chartex" xmlns:cx8="http://schemas.microsoft.com/office/drawing/2016/5/14/chartex" xmlns:mc="http://schemas.openxmlformats.org/markup-compatibility/2006" xmlns:aink="http://schemas.microsoft.com/office/drawing/2016/ink" xmlns:am3d="http://schemas.microsoft.com/office/drawing/2017/model3d" xmlns:o="urn:schemas-microsoft-com:office:office" xmlns:oel="http://schemas.microsoft.com/office/2019/extlst" xmlns:r="http://schemas.openxmlformats.org/officeDocument/2006/relationships" xmlns:m="http://schemas.openxmlformats.org/officeDocument/2006/math" xmlns:v="urn:schemas-microsoft-com:vml" xmlns:wp14="http://schemas.microsoft.com/office/word/2010/wordprocessingDrawing" xmlns:wp="http://schemas.openxmlformats.org/drawingml/2006/wordprocessingDrawing" xmlns:w10="urn:schemas-microsoft-com:office:word" xmlns:w="http://schemas.openxmlformats.org/wordprocessingml/2006/main" xmlns:w14="http://schemas.microsoft.com/office/word/2010/wordml" xmlns:w15="http://schemas.microsoft.com/office/word/2012/wordml" xmlns:w16cei="http://schemas.microsoft.com/office/word/2026/wordml/cei" xmlns:w16cex="http://schemas.microsoft.com/office/word/2018/wordml/cex" xmlns:w16cid="http://schemas.microsoft.com/office/word/2016/wordml/cid" xmlns:w16="http://schemas.microsoft.com/office/word/2018/wordml" xmlns:w16du="http://schemas.microsoft.com/office/word/2023/wordml/word16du" xmlns:w16sdtdh="http://schemas.microsoft.com/office/word/2020/wordml/sdtdatahash" xmlns:w16sdtfl="http://schemas.microsoft.com/office/word/2024/wordml/sdtformatlock" xmlns:w16se="http://schemas.microsoft.com/office/word/2015/wordml/symex" xmlns:wpg="http://schemas.microsoft.com/office/word/2010/wordprocessingGroup" xmlns:wpi="http://schemas.microsoft.com/office/word/2010/wordprocessingInk" xmlns:wne="http://schemas.microsoft.com/office/word/2006/wordml" xmlns:wps="http://schemas.microsoft.com/office/word/2010/wordprocessingShape" mc:Ignorable="w14 w15 w16se w16cid w16 w16cex w16sdtdh w16sdtfl w16du wp14">
   <w:tbl>
     <w:tblPr>
       <w:tblStyle w:val="Tablaconcuadrcula"/>
@@ -2994,7 +3425,7 @@
 </file>
 
 <file path=word/numbering.xml><?xml version="1.0" encoding="utf-8"?>
-<w:numbering xmlns:wpc="http://schemas.microsoft.com/office/word/2010/wordprocessingCanvas" xmlns:cx="http://schemas.microsoft.com/office/drawing/2014/chartex" xmlns:mc="http://schemas.openxmlformats.org/markup-compatibility/2006" xmlns:o="urn:schemas-microsoft-com:office:office" xmlns:r="http://schemas.openxmlformats.org/officeDocument/2006/relationships" xmlns:m="http://schemas.openxmlformats.org/officeDocument/2006/math" xmlns:v="urn:schemas-microsoft-com:vml" xmlns:wp14="http://schemas.microsoft.com/office/word/2010/wordprocessingDrawing" xmlns:wp="http://schemas.openxmlformats.org/drawingml/2006/wordprocessingDrawing" xmlns:w10="urn:schemas-microsoft-com:office:word" xmlns:w="http://schemas.openxmlformats.org/wordprocessingml/2006/main" xmlns:w14="http://schemas.microsoft.com/office/word/2010/wordml" xmlns:w15="http://schemas.microsoft.com/office/word/2012/wordml" xmlns:w16se="http://schemas.microsoft.com/office/word/2015/wordml/symex" xmlns:wpg="http://schemas.microsoft.com/office/word/2010/wordprocessingGroup" xmlns:wpi="http://schemas.microsoft.com/office/word/2010/wordprocessingInk" xmlns:wne="http://schemas.microsoft.com/office/word/2006/wordml" xmlns:wps="http://schemas.microsoft.com/office/word/2010/wordprocessingShape" mc:Ignorable="w14 w15 w16se wp14">
+<w:numbering xmlns:wpc="http://schemas.microsoft.com/office/word/2010/wordprocessingCanvas" xmlns:cx="http://schemas.microsoft.com/office/drawing/2014/chartex" xmlns:cx1="http://schemas.microsoft.com/office/drawing/2015/9/8/chartex" xmlns:cx2="http://schemas.microsoft.com/office/drawing/2015/10/21/chartex" xmlns:cx3="http://schemas.microsoft.com/office/drawing/2016/5/9/chartex" xmlns:cx4="http://schemas.microsoft.com/office/drawing/2016/5/10/chartex" xmlns:cx5="http://schemas.microsoft.com/office/drawing/2016/5/11/chartex" xmlns:cx6="http://schemas.microsoft.com/office/drawing/2016/5/12/chartex" xmlns:cx7="http://schemas.microsoft.com/office/drawing/2016/5/13/chartex" xmlns:cx8="http://schemas.microsoft.com/office/drawing/2016/5/14/chartex" xmlns:mc="http://schemas.openxmlformats.org/markup-compatibility/2006" xmlns:aink="http://schemas.microsoft.com/office/drawing/2016/ink" xmlns:am3d="http://schemas.microsoft.com/office/drawing/2017/model3d" xmlns:o="urn:schemas-microsoft-com:office:office" xmlns:oel="http://schemas.microsoft.com/office/2019/extlst" xmlns:r="http://schemas.openxmlformats.org/officeDocument/2006/relationships" xmlns:m="http://schemas.openxmlformats.org/officeDocument/2006/math" xmlns:v="urn:schemas-microsoft-com:vml" xmlns:wp14="http://schemas.microsoft.com/office/word/2010/wordprocessingDrawing" xmlns:wp="http://schemas.openxmlformats.org/drawingml/2006/wordprocessingDrawing" xmlns:w10="urn:schemas-microsoft-com:office:word" xmlns:w="http://schemas.openxmlformats.org/wordprocessingml/2006/main" xmlns:w14="http://schemas.microsoft.com/office/word/2010/wordml" xmlns:w15="http://schemas.microsoft.com/office/word/2012/wordml" xmlns:w16cei="http://schemas.microsoft.com/office/word/2026/wordml/cei" xmlns:w16cex="http://schemas.microsoft.com/office/word/2018/wordml/cex" xmlns:w16cid="http://schemas.microsoft.com/office/word/2016/wordml/cid" xmlns:w16="http://schemas.microsoft.com/office/word/2018/wordml" xmlns:w16du="http://schemas.microsoft.com/office/word/2023/wordml/word16du" xmlns:w16sdtdh="http://schemas.microsoft.com/office/word/2020/wordml/sdtdatahash" xmlns:w16sdtfl="http://schemas.microsoft.com/office/word/2024/wordml/sdtformatlock" xmlns:w16se="http://schemas.microsoft.com/office/word/2015/wordml/symex" xmlns:wpg="http://schemas.microsoft.com/office/word/2010/wordprocessingGroup" xmlns:wpi="http://schemas.microsoft.com/office/word/2010/wordprocessingInk" xmlns:wne="http://schemas.microsoft.com/office/word/2006/wordml" xmlns:wps="http://schemas.microsoft.com/office/word/2010/wordprocessingShape" mc:Ignorable="w14 w15 w16se w16cid w16 w16cex w16sdtdh w16sdtfl w16du wp14">
   <w:abstractNum w:abstractNumId="0" w15:restartNumberingAfterBreak="0">
     <w:nsid w:val="049156A1"/>
     <w:multiLevelType w:val="hybridMultilevel"/>
@@ -7568,124 +7999,124 @@
       </w:rPr>
     </w:lvl>
   </w:abstractNum>
-  <w:num w:numId="1">
+  <w:num w:numId="1" w16cid:durableId="1739596081">
     <w:abstractNumId w:val="3"/>
   </w:num>
-  <w:num w:numId="2">
+  <w:num w:numId="2" w16cid:durableId="902104502">
     <w:abstractNumId w:val="8"/>
   </w:num>
-  <w:num w:numId="3">
+  <w:num w:numId="3" w16cid:durableId="1537233407">
     <w:abstractNumId w:val="12"/>
   </w:num>
-  <w:num w:numId="4">
+  <w:num w:numId="4" w16cid:durableId="883753269">
     <w:abstractNumId w:val="28"/>
   </w:num>
-  <w:num w:numId="5">
+  <w:num w:numId="5" w16cid:durableId="543448016">
     <w:abstractNumId w:val="30"/>
   </w:num>
-  <w:num w:numId="6">
+  <w:num w:numId="6" w16cid:durableId="899630439">
     <w:abstractNumId w:val="4"/>
   </w:num>
-  <w:num w:numId="7">
+  <w:num w:numId="7" w16cid:durableId="989141835">
     <w:abstractNumId w:val="11"/>
   </w:num>
-  <w:num w:numId="8">
+  <w:num w:numId="8" w16cid:durableId="1610968275">
     <w:abstractNumId w:val="19"/>
   </w:num>
-  <w:num w:numId="9">
+  <w:num w:numId="9" w16cid:durableId="1817182601">
     <w:abstractNumId w:val="15"/>
   </w:num>
-  <w:num w:numId="10">
+  <w:num w:numId="10" w16cid:durableId="217326761">
     <w:abstractNumId w:val="9"/>
   </w:num>
-  <w:num w:numId="11">
+  <w:num w:numId="11" w16cid:durableId="468858826">
     <w:abstractNumId w:val="24"/>
   </w:num>
-  <w:num w:numId="12">
+  <w:num w:numId="12" w16cid:durableId="2020353423">
     <w:abstractNumId w:val="35"/>
   </w:num>
-  <w:num w:numId="13">
+  <w:num w:numId="13" w16cid:durableId="478768356">
     <w:abstractNumId w:val="29"/>
   </w:num>
-  <w:num w:numId="14">
+  <w:num w:numId="14" w16cid:durableId="418605293">
     <w:abstractNumId w:val="1"/>
   </w:num>
-  <w:num w:numId="15">
+  <w:num w:numId="15" w16cid:durableId="83888705">
     <w:abstractNumId w:val="36"/>
   </w:num>
-  <w:num w:numId="16">
+  <w:num w:numId="16" w16cid:durableId="1616867066">
     <w:abstractNumId w:val="21"/>
   </w:num>
-  <w:num w:numId="17">
+  <w:num w:numId="17" w16cid:durableId="87623741">
     <w:abstractNumId w:val="17"/>
   </w:num>
-  <w:num w:numId="18">
+  <w:num w:numId="18" w16cid:durableId="633760053">
     <w:abstractNumId w:val="31"/>
   </w:num>
-  <w:num w:numId="19">
+  <w:num w:numId="19" w16cid:durableId="1469123835">
     <w:abstractNumId w:val="10"/>
   </w:num>
-  <w:num w:numId="20">
+  <w:num w:numId="20" w16cid:durableId="1035076914">
     <w:abstractNumId w:val="39"/>
   </w:num>
-  <w:num w:numId="21">
+  <w:num w:numId="21" w16cid:durableId="1986203985">
     <w:abstractNumId w:val="34"/>
   </w:num>
-  <w:num w:numId="22">
+  <w:num w:numId="22" w16cid:durableId="197201560">
     <w:abstractNumId w:val="13"/>
   </w:num>
-  <w:num w:numId="23">
+  <w:num w:numId="23" w16cid:durableId="979961938">
     <w:abstractNumId w:val="14"/>
   </w:num>
-  <w:num w:numId="24">
+  <w:num w:numId="24" w16cid:durableId="763847154">
     <w:abstractNumId w:val="5"/>
   </w:num>
-  <w:num w:numId="25">
+  <w:num w:numId="25" w16cid:durableId="1912615242">
     <w:abstractNumId w:val="16"/>
   </w:num>
-  <w:num w:numId="26">
+  <w:num w:numId="26" w16cid:durableId="1373265047">
     <w:abstractNumId w:val="20"/>
   </w:num>
-  <w:num w:numId="27">
+  <w:num w:numId="27" w16cid:durableId="932055251">
     <w:abstractNumId w:val="23"/>
   </w:num>
-  <w:num w:numId="28">
+  <w:num w:numId="28" w16cid:durableId="1333601408">
     <w:abstractNumId w:val="0"/>
   </w:num>
-  <w:num w:numId="29">
+  <w:num w:numId="29" w16cid:durableId="1882864874">
     <w:abstractNumId w:val="18"/>
   </w:num>
-  <w:num w:numId="30">
+  <w:num w:numId="30" w16cid:durableId="1230535193">
     <w:abstractNumId w:val="22"/>
   </w:num>
-  <w:num w:numId="31">
+  <w:num w:numId="31" w16cid:durableId="925116063">
     <w:abstractNumId w:val="2"/>
   </w:num>
-  <w:num w:numId="32">
+  <w:num w:numId="32" w16cid:durableId="2106027747">
     <w:abstractNumId w:val="7"/>
   </w:num>
-  <w:num w:numId="33">
+  <w:num w:numId="33" w16cid:durableId="8070848">
     <w:abstractNumId w:val="32"/>
   </w:num>
-  <w:num w:numId="34">
+  <w:num w:numId="34" w16cid:durableId="932858449">
     <w:abstractNumId w:val="38"/>
   </w:num>
-  <w:num w:numId="35">
+  <w:num w:numId="35" w16cid:durableId="573785971">
     <w:abstractNumId w:val="6"/>
   </w:num>
-  <w:num w:numId="36">
+  <w:num w:numId="36" w16cid:durableId="39870156">
     <w:abstractNumId w:val="25"/>
   </w:num>
-  <w:num w:numId="37">
+  <w:num w:numId="37" w16cid:durableId="1836913602">
     <w:abstractNumId w:val="37"/>
   </w:num>
-  <w:num w:numId="38">
+  <w:num w:numId="38" w16cid:durableId="74787081">
     <w:abstractNumId w:val="27"/>
   </w:num>
-  <w:num w:numId="39">
+  <w:num w:numId="39" w16cid:durableId="514808090">
     <w:abstractNumId w:val="26"/>
   </w:num>
-  <w:num w:numId="40">
+  <w:num w:numId="40" w16cid:durableId="1434931656">
     <w:abstractNumId w:val="33"/>
   </w:num>
   <w:numIdMacAtCleanup w:val="18"/>
@@ -7693,7 +8124,7 @@
 </file>
 
 <file path=word/styles.xml><?xml version="1.0" encoding="utf-8"?>
-<w:styles xmlns:mc="http://schemas.openxmlformats.org/markup-compatibility/2006" xmlns:r="http://schemas.openxmlformats.org/officeDocument/2006/relationships" xmlns:w="http://schemas.openxmlformats.org/wordprocessingml/2006/main" xmlns:w14="http://schemas.microsoft.com/office/word/2010/wordml" xmlns:w15="http://schemas.microsoft.com/office/word/2012/wordml" xmlns:w16se="http://schemas.microsoft.com/office/word/2015/wordml/symex" mc:Ignorable="w14 w15 w16se">
+<w:styles xmlns:mc="http://schemas.openxmlformats.org/markup-compatibility/2006" xmlns:r="http://schemas.openxmlformats.org/officeDocument/2006/relationships" xmlns:w="http://schemas.openxmlformats.org/wordprocessingml/2006/main" xmlns:w14="http://schemas.microsoft.com/office/word/2010/wordml" xmlns:w15="http://schemas.microsoft.com/office/word/2012/wordml" xmlns:w16cex="http://schemas.microsoft.com/office/word/2018/wordml/cex" xmlns:w16cid="http://schemas.microsoft.com/office/word/2016/wordml/cid" xmlns:w16="http://schemas.microsoft.com/office/word/2018/wordml" xmlns:w16du="http://schemas.microsoft.com/office/word/2023/wordml/word16du" xmlns:w16sdtdh="http://schemas.microsoft.com/office/word/2020/wordml/sdtdatahash" xmlns:w16sdtfl="http://schemas.microsoft.com/office/word/2024/wordml/sdtformatlock" xmlns:w16se="http://schemas.microsoft.com/office/word/2015/wordml/symex" mc:Ignorable="w14 w15 w16se w16cid w16 w16cex w16sdtdh w16sdtfl w16du">
   <w:docDefaults>
     <w:rPrDefault>
       <w:rPr>
@@ -7709,7 +8140,7 @@
       </w:pPr>
     </w:pPrDefault>
   </w:docDefaults>
-  <w:latentStyles w:defLockedState="0" w:defUIPriority="99" w:defSemiHidden="0" w:defUnhideWhenUsed="0" w:defQFormat="0" w:count="371">
+  <w:latentStyles w:defLockedState="0" w:defUIPriority="99" w:defSemiHidden="0" w:defUnhideWhenUsed="0" w:defQFormat="0" w:count="376">
     <w:lsdException w:name="Normal" w:uiPriority="0" w:qFormat="1"/>
     <w:lsdException w:name="heading 1" w:uiPriority="9" w:qFormat="1"/>
     <w:lsdException w:name="heading 2" w:semiHidden="1" w:uiPriority="9" w:unhideWhenUsed="1" w:qFormat="1"/>
@@ -8081,6 +8512,11 @@
     <w:lsdException w:name="List Table 5 Dark Accent 6" w:uiPriority="50"/>
     <w:lsdException w:name="List Table 6 Colorful Accent 6" w:uiPriority="51"/>
     <w:lsdException w:name="List Table 7 Colorful Accent 6" w:uiPriority="52"/>
+    <w:lsdException w:name="Mention" w:semiHidden="1" w:unhideWhenUsed="1"/>
+    <w:lsdException w:name="Smart Hyperlink" w:semiHidden="1" w:unhideWhenUsed="1"/>
+    <w:lsdException w:name="Hashtag" w:semiHidden="1" w:unhideWhenUsed="1"/>
+    <w:lsdException w:name="Unresolved Mention" w:semiHidden="1" w:unhideWhenUsed="1"/>
+    <w:lsdException w:name="Smart Link" w:semiHidden="1" w:unhideWhenUsed="1"/>
   </w:latentStyles>
   <w:style w:type="paragraph" w:default="1" w:styleId="Normal">
     <w:name w:val="Normal"/>
@@ -8154,7 +8590,6 @@
   <w:style w:type="character" w:default="1" w:styleId="Fuentedeprrafopredeter">
     <w:name w:val="Default Paragraph Font"/>
     <w:uiPriority w:val="1"/>
-    <w:semiHidden/>
     <w:unhideWhenUsed/>
   </w:style>
   <w:style w:type="table" w:default="1" w:styleId="Tablanormal">
@@ -9064,7 +9499,7 @@
       <w:szCs w:val="24"/>
     </w:rPr>
   </w:style>
-  <w:style w:type="table" w:styleId="Cuadrculadetablaclara">
+  <w:style w:type="table" w:styleId="Tablaconcuadrculaclara">
     <w:name w:val="Grid Table Light"/>
     <w:basedOn w:val="Tablanormal"/>
     <w:uiPriority w:val="40"/>
@@ -9086,7 +9521,7 @@
   <w:style w:type="table" w:customStyle="1" w:styleId="Cuadrculadetablaclara1">
     <w:name w:val="Cuadrícula de tabla clara1"/>
     <w:basedOn w:val="Tablanormal"/>
-    <w:next w:val="Cuadrculadetablaclara"/>
+    <w:next w:val="Tablaconcuadrculaclara"/>
     <w:uiPriority w:val="40"/>
     <w:rsid w:val="00943DF1"/>
     <w:pPr>
@@ -9127,7 +9562,7 @@
       <w:spacing w:after="0" w:line="240" w:lineRule="auto"/>
     </w:pPr>
   </w:style>
-  <w:style w:type="character" w:styleId="Textoennegrita">
+  <w:style w:type="character" w:styleId="Fuerte">
     <w:name w:val="Strong"/>
     <w:basedOn w:val="Fuentedeprrafopredeter"/>
     <w:uiPriority w:val="22"/>
@@ -9139,532 +9574,6 @@
     </w:rPr>
   </w:style>
 </w:styles>
-</file>
-
-<file path=word/glossary/document.xml><?xml version="1.0" encoding="utf-8"?>
-<w:glossaryDocument xmlns:wpc="http://schemas.microsoft.com/office/word/2010/wordprocessingCanvas" xmlns:cx="http://schemas.microsoft.com/office/drawing/2014/chartex" xmlns:mc="http://schemas.openxmlformats.org/markup-compatibility/2006" xmlns:o="urn:schemas-microsoft-com:office:office" xmlns:r="http://schemas.openxmlformats.org/officeDocument/2006/relationships" xmlns:m="http://schemas.openxmlformats.org/officeDocument/2006/math" xmlns:v="urn:schemas-microsoft-com:vml" xmlns:wp14="http://schemas.microsoft.com/office/word/2010/wordprocessingDrawing" xmlns:wp="http://schemas.openxmlformats.org/drawingml/2006/wordprocessingDrawing" xmlns:w10="urn:schemas-microsoft-com:office:word" xmlns:w="http://schemas.openxmlformats.org/wordprocessingml/2006/main" xmlns:w14="http://schemas.microsoft.com/office/word/2010/wordml" xmlns:w15="http://schemas.microsoft.com/office/word/2012/wordml" xmlns:w16se="http://schemas.microsoft.com/office/word/2015/wordml/symex" xmlns:wpg="http://schemas.microsoft.com/office/word/2010/wordprocessingGroup" xmlns:wpi="http://schemas.microsoft.com/office/word/2010/wordprocessingInk" xmlns:wne="http://schemas.microsoft.com/office/word/2006/wordml" xmlns:wps="http://schemas.microsoft.com/office/word/2010/wordprocessingShape" mc:Ignorable="w14 w15 w16se wp14"/>
-</file>
-
-<file path=word/glossary/fontTable.xml><?xml version="1.0" encoding="utf-8"?>
-<w:fonts xmlns:mc="http://schemas.openxmlformats.org/markup-compatibility/2006" xmlns:r="http://schemas.openxmlformats.org/officeDocument/2006/relationships" xmlns:w="http://schemas.openxmlformats.org/wordprocessingml/2006/main" xmlns:w14="http://schemas.microsoft.com/office/word/2010/wordml" xmlns:w15="http://schemas.microsoft.com/office/word/2012/wordml" xmlns:w16se="http://schemas.microsoft.com/office/word/2015/wordml/symex" mc:Ignorable="w14 w15 w16se">
-  <w:font w:name="Calibri">
-    <w:panose1 w:val="020F0502020204030204"/>
-    <w:charset w:val="00"/>
-    <w:family w:val="swiss"/>
-    <w:pitch w:val="variable"/>
-    <w:sig w:usb0="E4002EFF" w:usb1="C000247B" w:usb2="00000009" w:usb3="00000000" w:csb0="000001FF" w:csb1="00000000"/>
-  </w:font>
-  <w:font w:name="Times New Roman">
-    <w:panose1 w:val="02020603050405020304"/>
-    <w:charset w:val="00"/>
-    <w:family w:val="roman"/>
-    <w:pitch w:val="variable"/>
-    <w:sig w:usb0="E0002EFF" w:usb1="C000785B" w:usb2="00000009" w:usb3="00000000" w:csb0="000001FF" w:csb1="00000000"/>
-  </w:font>
-  <w:font w:name="Courier New">
-    <w:panose1 w:val="02070309020205020404"/>
-    <w:charset w:val="00"/>
-    <w:family w:val="modern"/>
-    <w:pitch w:val="fixed"/>
-    <w:sig w:usb0="E0002EFF" w:usb1="C0007843" w:usb2="00000009" w:usb3="00000000" w:csb0="000001FF" w:csb1="00000000"/>
-  </w:font>
-  <w:font w:name="Wingdings">
-    <w:panose1 w:val="05000000000000000000"/>
-    <w:charset w:val="02"/>
-    <w:family w:val="auto"/>
-    <w:pitch w:val="variable"/>
-    <w:sig w:usb0="00000000" w:usb1="10000000" w:usb2="00000000" w:usb3="00000000" w:csb0="80000000" w:csb1="00000000"/>
-  </w:font>
-  <w:font w:name="Symbol">
-    <w:panose1 w:val="05050102010706020507"/>
-    <w:charset w:val="02"/>
-    <w:family w:val="roman"/>
-    <w:pitch w:val="variable"/>
-    <w:sig w:usb0="00000000" w:usb1="10000000" w:usb2="00000000" w:usb3="00000000" w:csb0="80000000" w:csb1="00000000"/>
-  </w:font>
-  <w:font w:name="Calibri Light">
-    <w:panose1 w:val="020F0302020204030204"/>
-    <w:charset w:val="00"/>
-    <w:family w:val="swiss"/>
-    <w:pitch w:val="variable"/>
-    <w:sig w:usb0="E4002EFF" w:usb1="C000247B" w:usb2="00000009" w:usb3="00000000" w:csb0="000001FF" w:csb1="00000000"/>
-  </w:font>
-  <w:font w:name="Segoe UI">
-    <w:panose1 w:val="020B0502040204020203"/>
-    <w:charset w:val="00"/>
-    <w:family w:val="swiss"/>
-    <w:pitch w:val="variable"/>
-    <w:sig w:usb0="E4002EFF" w:usb1="C000E47F" w:usb2="00000009" w:usb3="00000000" w:csb0="000001FF" w:csb1="00000000"/>
-  </w:font>
-  <w:font w:name="Century Gothic">
-    <w:panose1 w:val="020B0502020202020204"/>
-    <w:charset w:val="00"/>
-    <w:family w:val="swiss"/>
-    <w:pitch w:val="variable"/>
-    <w:sig w:usb0="00000287" w:usb1="00000000" w:usb2="00000000" w:usb3="00000000" w:csb0="0000009F" w:csb1="00000000"/>
-  </w:font>
-</w:fonts>
-</file>
-
-<file path=word/glossary/settings.xml><?xml version="1.0" encoding="utf-8"?>
-<w:settings xmlns:mc="http://schemas.openxmlformats.org/markup-compatibility/2006" xmlns:o="urn:schemas-microsoft-com:office:office" xmlns:r="http://schemas.openxmlformats.org/officeDocument/2006/relationships" xmlns:m="http://schemas.openxmlformats.org/officeDocument/2006/math" xmlns:v="urn:schemas-microsoft-com:vml" xmlns:w10="urn:schemas-microsoft-com:office:word" xmlns:w="http://schemas.openxmlformats.org/wordprocessingml/2006/main" xmlns:w14="http://schemas.microsoft.com/office/word/2010/wordml" xmlns:w15="http://schemas.microsoft.com/office/word/2012/wordml" xmlns:w16se="http://schemas.microsoft.com/office/word/2015/wordml/symex" xmlns:sl="http://schemas.openxmlformats.org/schemaLibrary/2006/main" mc:Ignorable="w14 w15 w16se">
-  <w:defaultTabStop w:val="708"/>
-  <w:hyphenationZone w:val="425"/>
-  <w:characterSpacingControl w:val="doNotCompress"/>
-  <w:compat>
-    <w:useFELayout/>
-    <w:compatSetting w:name="compatibilityMode" w:uri="http://schemas.microsoft.com/office/word" w:val="12"/>
-  </w:compat>
-  <w:rsids>
-    <w:rsidRoot w:val="004A7892"/>
-    <w:rsid w:val="004A7892"/>
-  </w:rsids>
-  <m:mathPr>
-    <m:mathFont m:val="Cambria Math"/>
-    <m:brkBin m:val="before"/>
-    <m:brkBinSub m:val="--"/>
-    <m:smallFrac m:val="0"/>
-    <m:dispDef/>
-    <m:lMargin m:val="0"/>
-    <m:rMargin m:val="0"/>
-    <m:defJc m:val="centerGroup"/>
-    <m:wrapIndent m:val="1440"/>
-    <m:intLim m:val="subSup"/>
-    <m:naryLim m:val="undOvr"/>
-  </m:mathPr>
-  <w:themeFontLang w:val="es-CL"/>
-  <w:clrSchemeMapping w:bg1="light1" w:t1="dark1" w:bg2="light2" w:t2="dark2" w:accent1="accent1" w:accent2="accent2" w:accent3="accent3" w:accent4="accent4" w:accent5="accent5" w:accent6="accent6" w:hyperlink="hyperlink" w:followedHyperlink="followedHyperlink"/>
-  <w:decimalSymbol w:val=","/>
-  <w:listSeparator w:val=";"/>
-</w:settings>
-</file>
-
-<file path=word/glossary/styles.xml><?xml version="1.0" encoding="utf-8"?>
-<w:styles xmlns:mc="http://schemas.openxmlformats.org/markup-compatibility/2006" xmlns:r="http://schemas.openxmlformats.org/officeDocument/2006/relationships" xmlns:w="http://schemas.openxmlformats.org/wordprocessingml/2006/main" xmlns:w14="http://schemas.microsoft.com/office/word/2010/wordml" xmlns:w15="http://schemas.microsoft.com/office/word/2012/wordml" xmlns:w16se="http://schemas.microsoft.com/office/word/2015/wordml/symex" mc:Ignorable="w14 w15 w16se">
-  <w:docDefaults>
-    <w:rPrDefault>
-      <w:rPr>
-        <w:rFonts w:asciiTheme="minorHAnsi" w:eastAsiaTheme="minorEastAsia" w:hAnsiTheme="minorHAnsi" w:cstheme="minorBidi"/>
-        <w:sz w:val="22"/>
-        <w:szCs w:val="22"/>
-        <w:lang w:val="es-CL" w:eastAsia="es-CL" w:bidi="ar-SA"/>
-      </w:rPr>
-    </w:rPrDefault>
-    <w:pPrDefault>
-      <w:pPr>
-        <w:spacing w:after="160" w:line="259" w:lineRule="auto"/>
-      </w:pPr>
-    </w:pPrDefault>
-  </w:docDefaults>
-  <w:latentStyles w:defLockedState="0" w:defUIPriority="99" w:defSemiHidden="0" w:defUnhideWhenUsed="0" w:defQFormat="0" w:count="371">
-    <w:lsdException w:name="Normal" w:uiPriority="0" w:qFormat="1"/>
-    <w:lsdException w:name="heading 1" w:uiPriority="9" w:qFormat="1"/>
-    <w:lsdException w:name="heading 2" w:semiHidden="1" w:uiPriority="9" w:unhideWhenUsed="1" w:qFormat="1"/>
-    <w:lsdException w:name="heading 3" w:semiHidden="1" w:uiPriority="9" w:unhideWhenUsed="1" w:qFormat="1"/>
-    <w:lsdException w:name="heading 4" w:semiHidden="1" w:uiPriority="9" w:unhideWhenUsed="1" w:qFormat="1"/>
-    <w:lsdException w:name="heading 5" w:semiHidden="1" w:uiPriority="9" w:unhideWhenUsed="1" w:qFormat="1"/>
-    <w:lsdException w:name="heading 6" w:semiHidden="1" w:uiPriority="9" w:unhideWhenUsed="1" w:qFormat="1"/>
-    <w:lsdException w:name="heading 7" w:semiHidden="1" w:uiPriority="9" w:unhideWhenUsed="1" w:qFormat="1"/>
-    <w:lsdException w:name="heading 8" w:semiHidden="1" w:uiPriority="9" w:unhideWhenUsed="1" w:qFormat="1"/>
-    <w:lsdException w:name="heading 9" w:semiHidden="1" w:uiPriority="9" w:unhideWhenUsed="1" w:qFormat="1"/>
-    <w:lsdException w:name="index 1" w:semiHidden="1" w:unhideWhenUsed="1"/>
-    <w:lsdException w:name="index 2" w:semiHidden="1" w:unhideWhenUsed="1"/>
-    <w:lsdException w:name="index 3" w:semiHidden="1" w:unhideWhenUsed="1"/>
-    <w:lsdException w:name="index 4" w:semiHidden="1" w:unhideWhenUsed="1"/>
-    <w:lsdException w:name="index 5" w:semiHidden="1" w:unhideWhenUsed="1"/>
-    <w:lsdException w:name="index 6" w:semiHidden="1" w:unhideWhenUsed="1"/>
-    <w:lsdException w:name="index 7" w:semiHidden="1" w:unhideWhenUsed="1"/>
-    <w:lsdException w:name="index 8" w:semiHidden="1" w:unhideWhenUsed="1"/>
-    <w:lsdException w:name="index 9" w:semiHidden="1" w:unhideWhenUsed="1"/>
-    <w:lsdException w:name="toc 1" w:semiHidden="1" w:uiPriority="39" w:unhideWhenUsed="1"/>
-    <w:lsdException w:name="toc 2" w:semiHidden="1" w:uiPriority="39" w:unhideWhenUsed="1"/>
-    <w:lsdException w:name="toc 3" w:semiHidden="1" w:uiPriority="39" w:unhideWhenUsed="1"/>
-    <w:lsdException w:name="toc 4" w:semiHidden="1" w:uiPriority="39" w:unhideWhenUsed="1"/>
-    <w:lsdException w:name="toc 5" w:semiHidden="1" w:uiPriority="39" w:unhideWhenUsed="1"/>
-    <w:lsdException w:name="toc 6" w:semiHidden="1" w:uiPriority="39" w:unhideWhenUsed="1"/>
-    <w:lsdException w:name="toc 7" w:semiHidden="1" w:uiPriority="39" w:unhideWhenUsed="1"/>
-    <w:lsdException w:name="toc 8" w:semiHidden="1" w:uiPriority="39" w:unhideWhenUsed="1"/>
-    <w:lsdException w:name="toc 9" w:semiHidden="1" w:uiPriority="39" w:unhideWhenUsed="1"/>
-    <w:lsdException w:name="Normal Indent" w:semiHidden="1" w:unhideWhenUsed="1"/>
-    <w:lsdException w:name="footnote text" w:semiHidden="1" w:unhideWhenUsed="1"/>
-    <w:lsdException w:name="annotation text" w:semiHidden="1" w:unhideWhenUsed="1"/>
-    <w:lsdException w:name="header" w:semiHidden="1" w:unhideWhenUsed="1"/>
-    <w:lsdException w:name="footer" w:semiHidden="1" w:unhideWhenUsed="1"/>
-    <w:lsdException w:name="index heading" w:semiHidden="1" w:unhideWhenUsed="1"/>
-    <w:lsdException w:name="caption" w:semiHidden="1" w:uiPriority="35" w:unhideWhenUsed="1" w:qFormat="1"/>
-    <w:lsdException w:name="table of figures" w:semiHidden="1" w:unhideWhenUsed="1"/>
-    <w:lsdException w:name="envelope address" w:semiHidden="1" w:unhideWhenUsed="1"/>
-    <w:lsdException w:name="envelope return" w:semiHidden="1" w:unhideWhenUsed="1"/>
-    <w:lsdException w:name="footnote reference" w:semiHidden="1" w:unhideWhenUsed="1"/>
-    <w:lsdException w:name="annotation reference" w:semiHidden="1" w:unhideWhenUsed="1"/>
-    <w:lsdException w:name="line number" w:semiHidden="1" w:unhideWhenUsed="1"/>
-    <w:lsdException w:name="page number" w:semiHidden="1" w:unhideWhenUsed="1"/>
-    <w:lsdException w:name="endnote reference" w:semiHidden="1" w:unhideWhenUsed="1"/>
-    <w:lsdException w:name="endnote text" w:semiHidden="1" w:unhideWhenUsed="1"/>
-    <w:lsdException w:name="table of authorities" w:semiHidden="1" w:unhideWhenUsed="1"/>
-    <w:lsdException w:name="macro" w:semiHidden="1" w:unhideWhenUsed="1"/>
-    <w:lsdException w:name="toa heading" w:semiHidden="1" w:unhideWhenUsed="1"/>
-    <w:lsdException w:name="List" w:semiHidden="1" w:unhideWhenUsed="1"/>
-    <w:lsdException w:name="List Bullet" w:semiHidden="1" w:unhideWhenUsed="1"/>
-    <w:lsdException w:name="List Number" w:semiHidden="1" w:unhideWhenUsed="1"/>
-    <w:lsdException w:name="List 2" w:semiHidden="1" w:unhideWhenUsed="1"/>
-    <w:lsdException w:name="List 3" w:semiHidden="1" w:unhideWhenUsed="1"/>
-    <w:lsdException w:name="List 4" w:semiHidden="1" w:unhideWhenUsed="1"/>
-    <w:lsdException w:name="List 5" w:semiHidden="1" w:unhideWhenUsed="1"/>
-    <w:lsdException w:name="List Bullet 2" w:semiHidden="1" w:unhideWhenUsed="1"/>
-    <w:lsdException w:name="List Bullet 3" w:semiHidden="1" w:unhideWhenUsed="1"/>
-    <w:lsdException w:name="List Bullet 4" w:semiHidden="1" w:unhideWhenUsed="1"/>
-    <w:lsdException w:name="List Bullet 5" w:semiHidden="1" w:unhideWhenUsed="1"/>
-    <w:lsdException w:name="List Number 2" w:semiHidden="1" w:unhideWhenUsed="1"/>
-    <w:lsdException w:name="List Number 3" w:semiHidden="1" w:unhideWhenUsed="1"/>
-    <w:lsdException w:name="List Number 4" w:semiHidden="1" w:unhideWhenUsed="1"/>
-    <w:lsdException w:name="List Number 5" w:semiHidden="1" w:unhideWhenUsed="1"/>
-    <w:lsdException w:name="Title" w:uiPriority="10" w:qFormat="1"/>
-    <w:lsdException w:name="Closing" w:semiHidden="1" w:unhideWhenUsed="1"/>
-    <w:lsdException w:name="Signature" w:semiHidden="1" w:unhideWhenUsed="1"/>
-    <w:lsdException w:name="Default Paragraph Font" w:semiHidden="1" w:uiPriority="1" w:unhideWhenUsed="1"/>
-    <w:lsdException w:name="Body Text" w:semiHidden="1" w:unhideWhenUsed="1"/>
-    <w:lsdException w:name="Body Text Indent" w:semiHidden="1" w:unhideWhenUsed="1"/>
-    <w:lsdException w:name="List Continue" w:semiHidden="1" w:unhideWhenUsed="1"/>
-    <w:lsdException w:name="List Continue 2" w:semiHidden="1" w:unhideWhenUsed="1"/>
-    <w:lsdException w:name="List Continue 3" w:semiHidden="1" w:unhideWhenUsed="1"/>
-    <w:lsdException w:name="List Continue 4" w:semiHidden="1" w:unhideWhenUsed="1"/>
-    <w:lsdException w:name="List Continue 5" w:semiHidden="1" w:unhideWhenUsed="1"/>
-    <w:lsdException w:name="Message Header" w:semiHidden="1" w:unhideWhenUsed="1"/>
-    <w:lsdException w:name="Subtitle" w:uiPriority="11" w:qFormat="1"/>
-    <w:lsdException w:name="Salutation" w:semiHidden="1" w:unhideWhenUsed="1"/>
-    <w:lsdException w:name="Date" w:semiHidden="1" w:unhideWhenUsed="1"/>
-    <w:lsdException w:name="Body Text First Indent" w:semiHidden="1" w:unhideWhenUsed="1"/>
-    <w:lsdException w:name="Body Text First Indent 2" w:semiHidden="1" w:unhideWhenUsed="1"/>
-    <w:lsdException w:name="Note Heading" w:semiHidden="1" w:unhideWhenUsed="1"/>
-    <w:lsdException w:name="Body Text 2" w:semiHidden="1" w:unhideWhenUsed="1"/>
-    <w:lsdException w:name="Body Text 3" w:semiHidden="1" w:unhideWhenUsed="1"/>
-    <w:lsdException w:name="Body Text Indent 2" w:semiHidden="1" w:unhideWhenUsed="1"/>
-    <w:lsdException w:name="Body Text Indent 3" w:semiHidden="1" w:unhideWhenUsed="1"/>
-    <w:lsdException w:name="Block Text" w:semiHidden="1" w:unhideWhenUsed="1"/>
-    <w:lsdException w:name="Hyperlink" w:semiHidden="1" w:unhideWhenUsed="1"/>
-    <w:lsdException w:name="FollowedHyperlink" w:semiHidden="1" w:unhideWhenUsed="1"/>
-    <w:lsdException w:name="Strong" w:uiPriority="22" w:qFormat="1"/>
-    <w:lsdException w:name="Emphasis" w:uiPriority="20" w:qFormat="1"/>
-    <w:lsdException w:name="Document Map" w:semiHidden="1" w:unhideWhenUsed="1"/>
-    <w:lsdException w:name="Plain Text" w:semiHidden="1" w:unhideWhenUsed="1"/>
-    <w:lsdException w:name="E-mail Signature" w:semiHidden="1" w:unhideWhenUsed="1"/>
-    <w:lsdException w:name="HTML Top of Form" w:semiHidden="1" w:unhideWhenUsed="1"/>
-    <w:lsdException w:name="HTML Bottom of Form" w:semiHidden="1" w:unhideWhenUsed="1"/>
-    <w:lsdException w:name="Normal (Web)" w:semiHidden="1" w:unhideWhenUsed="1"/>
-    <w:lsdException w:name="HTML Acronym" w:semiHidden="1" w:unhideWhenUsed="1"/>
-    <w:lsdException w:name="HTML Address" w:semiHidden="1" w:unhideWhenUsed="1"/>
-    <w:lsdException w:name="HTML Cite" w:semiHidden="1" w:unhideWhenUsed="1"/>
-    <w:lsdException w:name="HTML Code" w:semiHidden="1" w:unhideWhenUsed="1"/>
-    <w:lsdException w:name="HTML Definition" w:semiHidden="1" w:unhideWhenUsed="1"/>
-    <w:lsdException w:name="HTML Keyboard" w:semiHidden="1" w:unhideWhenUsed="1"/>
-    <w:lsdException w:name="HTML Preformatted" w:semiHidden="1" w:unhideWhenUsed="1"/>
-    <w:lsdException w:name="HTML Sample" w:semiHidden="1" w:unhideWhenUsed="1"/>
-    <w:lsdException w:name="HTML Typewriter" w:semiHidden="1" w:unhideWhenUsed="1"/>
-    <w:lsdException w:name="HTML Variable" w:semiHidden="1" w:unhideWhenUsed="1"/>
-    <w:lsdException w:name="Normal Table" w:semiHidden="1" w:unhideWhenUsed="1"/>
-    <w:lsdException w:name="annotation subject" w:semiHidden="1" w:unhideWhenUsed="1"/>
-    <w:lsdException w:name="No List" w:semiHidden="1" w:unhideWhenUsed="1"/>
-    <w:lsdException w:name="Outline List 1" w:semiHidden="1" w:unhideWhenUsed="1"/>
-    <w:lsdException w:name="Outline List 2" w:semiHidden="1" w:unhideWhenUsed="1"/>
-    <w:lsdException w:name="Outline List 3" w:semiHidden="1" w:unhideWhenUsed="1"/>
-    <w:lsdException w:name="Table Simple 1" w:semiHidden="1" w:unhideWhenUsed="1"/>
-    <w:lsdException w:name="Table Simple 2" w:semiHidden="1" w:unhideWhenUsed="1"/>
-    <w:lsdException w:name="Table Simple 3" w:semiHidden="1" w:unhideWhenUsed="1"/>
-    <w:lsdException w:name="Table Classic 1" w:semiHidden="1" w:unhideWhenUsed="1"/>
-    <w:lsdException w:name="Table Classic 2" w:semiHidden="1" w:unhideWhenUsed="1"/>
-    <w:lsdException w:name="Table Classic 3" w:semiHidden="1" w:unhideWhenUsed="1"/>
-    <w:lsdException w:name="Table Classic 4" w:semiHidden="1" w:unhideWhenUsed="1"/>
-    <w:lsdException w:name="Table Colorful 1" w:semiHidden="1" w:unhideWhenUsed="1"/>
-    <w:lsdException w:name="Table Colorful 2" w:semiHidden="1" w:unhideWhenUsed="1"/>
-    <w:lsdException w:name="Table Colorful 3" w:semiHidden="1" w:unhideWhenUsed="1"/>
-    <w:lsdException w:name="Table Columns 1" w:semiHidden="1" w:unhideWhenUsed="1"/>
-    <w:lsdException w:name="Table Columns 2" w:semiHidden="1" w:unhideWhenUsed="1"/>
-    <w:lsdException w:name="Table Columns 3" w:semiHidden="1" w:unhideWhenUsed="1"/>
-    <w:lsdException w:name="Table Columns 4" w:semiHidden="1" w:unhideWhenUsed="1"/>
-    <w:lsdException w:name="Table Columns 5" w:semiHidden="1" w:unhideWhenUsed="1"/>
-    <w:lsdException w:name="Table Grid 1" w:semiHidden="1" w:unhideWhenUsed="1"/>
-    <w:lsdException w:name="Table Grid 2" w:semiHidden="1" w:unhideWhenUsed="1"/>
-    <w:lsdException w:name="Table Grid 3" w:semiHidden="1" w:unhideWhenUsed="1"/>
-    <w:lsdException w:name="Table Grid 4" w:semiHidden="1" w:unhideWhenUsed="1"/>
-    <w:lsdException w:name="Table Grid 5" w:semiHidden="1" w:unhideWhenUsed="1"/>
-    <w:lsdException w:name="Table Grid 6" w:semiHidden="1" w:unhideWhenUsed="1"/>
-    <w:lsdException w:name="Table Grid 7" w:semiHidden="1" w:unhideWhenUsed="1"/>
-    <w:lsdException w:name="Table Grid 8" w:semiHidden="1" w:unhideWhenUsed="1"/>
-    <w:lsdException w:name="Table List 1" w:semiHidden="1" w:unhideWhenUsed="1"/>
-    <w:lsdException w:name="Table List 2" w:semiHidden="1" w:unhideWhenUsed="1"/>
-    <w:lsdException w:name="Table List 3" w:semiHidden="1" w:unhideWhenUsed="1"/>
-    <w:lsdException w:name="Table List 4" w:semiHidden="1" w:unhideWhenUsed="1"/>
-    <w:lsdException w:name="Table List 5" w:semiHidden="1" w:unhideWhenUsed="1"/>
-    <w:lsdException w:name="Table List 6" w:semiHidden="1" w:unhideWhenUsed="1"/>
-    <w:lsdException w:name="Table List 7" w:semiHidden="1" w:unhideWhenUsed="1"/>
-    <w:lsdException w:name="Table List 8" w:semiHidden="1" w:unhideWhenUsed="1"/>
-    <w:lsdException w:name="Table 3D effects 1" w:semiHidden="1" w:unhideWhenUsed="1"/>
-    <w:lsdException w:name="Table 3D effects 2" w:semiHidden="1" w:unhideWhenUsed="1"/>
-    <w:lsdException w:name="Table 3D effects 3" w:semiHidden="1" w:unhideWhenUsed="1"/>
-    <w:lsdException w:name="Table Contemporary" w:semiHidden="1" w:unhideWhenUsed="1"/>
-    <w:lsdException w:name="Table Elegant" w:semiHidden="1" w:unhideWhenUsed="1"/>
-    <w:lsdException w:name="Table Professional" w:semiHidden="1" w:unhideWhenUsed="1"/>
-    <w:lsdException w:name="Table Subtle 1" w:semiHidden="1" w:unhideWhenUsed="1"/>
-    <w:lsdException w:name="Table Subtle 2" w:semiHidden="1" w:unhideWhenUsed="1"/>
-    <w:lsdException w:name="Table Web 1" w:semiHidden="1" w:unhideWhenUsed="1"/>
-    <w:lsdException w:name="Table Web 2" w:semiHidden="1" w:unhideWhenUsed="1"/>
-    <w:lsdException w:name="Table Web 3" w:semiHidden="1" w:unhideWhenUsed="1"/>
-    <w:lsdException w:name="Balloon Text" w:semiHidden="1" w:unhideWhenUsed="1"/>
-    <w:lsdException w:name="Table Grid" w:uiPriority="39"/>
-    <w:lsdException w:name="Table Theme" w:semiHidden="1" w:unhideWhenUsed="1"/>
-    <w:lsdException w:name="Placeholder Text" w:semiHidden="1"/>
-    <w:lsdException w:name="No Spacing" w:uiPriority="1" w:qFormat="1"/>
-    <w:lsdException w:name="Light Shading" w:uiPriority="60"/>
-    <w:lsdException w:name="Light List" w:uiPriority="61"/>
-    <w:lsdException w:name="Light Grid" w:uiPriority="62"/>
-    <w:lsdException w:name="Medium Shading 1" w:uiPriority="63"/>
-    <w:lsdException w:name="Medium Shading 2" w:uiPriority="64"/>
-    <w:lsdException w:name="Medium List 1" w:uiPriority="65"/>
-    <w:lsdException w:name="Medium List 2" w:uiPriority="66"/>
-    <w:lsdException w:name="Medium Grid 1" w:uiPriority="67"/>
-    <w:lsdException w:name="Medium Grid 2" w:uiPriority="68"/>
-    <w:lsdException w:name="Medium Grid 3" w:uiPriority="69"/>
-    <w:lsdException w:name="Dark List" w:uiPriority="70"/>
-    <w:lsdException w:name="Colorful Shading" w:uiPriority="71"/>
-    <w:lsdException w:name="Colorful List" w:uiPriority="72"/>
-    <w:lsdException w:name="Colorful Grid" w:uiPriority="73"/>
-    <w:lsdException w:name="Light Shading Accent 1" w:uiPriority="60"/>
-    <w:lsdException w:name="Light List Accent 1" w:uiPriority="61"/>
-    <w:lsdException w:name="Light Grid Accent 1" w:uiPriority="62"/>
-    <w:lsdException w:name="Medium Shading 1 Accent 1" w:uiPriority="63"/>
-    <w:lsdException w:name="Medium Shading 2 Accent 1" w:uiPriority="64"/>
-    <w:lsdException w:name="Medium List 1 Accent 1" w:uiPriority="65"/>
-    <w:lsdException w:name="Revision" w:semiHidden="1"/>
-    <w:lsdException w:name="List Paragraph" w:uiPriority="34" w:qFormat="1"/>
-    <w:lsdException w:name="Quote" w:uiPriority="29" w:qFormat="1"/>
-    <w:lsdException w:name="Intense Quote" w:uiPriority="30" w:qFormat="1"/>
-    <w:lsdException w:name="Medium List 2 Accent 1" w:uiPriority="66"/>
-    <w:lsdException w:name="Medium Grid 1 Accent 1" w:uiPriority="67"/>
-    <w:lsdException w:name="Medium Grid 2 Accent 1" w:uiPriority="68"/>
-    <w:lsdException w:name="Medium Grid 3 Accent 1" w:uiPriority="69"/>
-    <w:lsdException w:name="Dark List Accent 1" w:uiPriority="70"/>
-    <w:lsdException w:name="Colorful Shading Accent 1" w:uiPriority="71"/>
-    <w:lsdException w:name="Colorful List Accent 1" w:uiPriority="72"/>
-    <w:lsdException w:name="Colorful Grid Accent 1" w:uiPriority="73"/>
-    <w:lsdException w:name="Light Shading Accent 2" w:uiPriority="60"/>
-    <w:lsdException w:name="Light List Accent 2" w:uiPriority="61"/>
-    <w:lsdException w:name="Light Grid Accent 2" w:uiPriority="62"/>
-    <w:lsdException w:name="Medium Shading 1 Accent 2" w:uiPriority="63"/>
-    <w:lsdException w:name="Medium Shading 2 Accent 2" w:uiPriority="64"/>
-    <w:lsdException w:name="Medium List 1 Accent 2" w:uiPriority="65"/>
-    <w:lsdException w:name="Medium List 2 Accent 2" w:uiPriority="66"/>
-    <w:lsdException w:name="Medium Grid 1 Accent 2" w:uiPriority="67"/>
-    <w:lsdException w:name="Medium Grid 2 Accent 2" w:uiPriority="68"/>
-    <w:lsdException w:name="Medium Grid 3 Accent 2" w:uiPriority="69"/>
-    <w:lsdException w:name="Dark List Accent 2" w:uiPriority="70"/>
-    <w:lsdException w:name="Colorful Shading Accent 2" w:uiPriority="71"/>
-    <w:lsdException w:name="Colorful List Accent 2" w:uiPriority="72"/>
-    <w:lsdException w:name="Colorful Grid Accent 2" w:uiPriority="73"/>
-    <w:lsdException w:name="Light Shading Accent 3" w:uiPriority="60"/>
-    <w:lsdException w:name="Light List Accent 3" w:uiPriority="61"/>
-    <w:lsdException w:name="Light Grid Accent 3" w:uiPriority="62"/>
-    <w:lsdException w:name="Medium Shading 1 Accent 3" w:uiPriority="63"/>
-    <w:lsdException w:name="Medium Shading 2 Accent 3" w:uiPriority="64"/>
-    <w:lsdException w:name="Medium List 1 Accent 3" w:uiPriority="65"/>
-    <w:lsdException w:name="Medium List 2 Accent 3" w:uiPriority="66"/>
-    <w:lsdException w:name="Medium Grid 1 Accent 3" w:uiPriority="67"/>
-    <w:lsdException w:name="Medium Grid 2 Accent 3" w:uiPriority="68"/>
-    <w:lsdException w:name="Medium Grid 3 Accent 3" w:uiPriority="69"/>
-    <w:lsdException w:name="Dark List Accent 3" w:uiPriority="70"/>
-    <w:lsdException w:name="Colorful Shading Accent 3" w:uiPriority="71"/>
-    <w:lsdException w:name="Colorful List Accent 3" w:uiPriority="72"/>
-    <w:lsdException w:name="Colorful Grid Accent 3" w:uiPriority="73"/>
-    <w:lsdException w:name="Light Shading Accent 4" w:uiPriority="60"/>
-    <w:lsdException w:name="Light List Accent 4" w:uiPriority="61"/>
-    <w:lsdException w:name="Light Grid Accent 4" w:uiPriority="62"/>
-    <w:lsdException w:name="Medium Shading 1 Accent 4" w:uiPriority="63"/>
-    <w:lsdException w:name="Medium Shading 2 Accent 4" w:uiPriority="64"/>
-    <w:lsdException w:name="Medium List 1 Accent 4" w:uiPriority="65"/>
-    <w:lsdException w:name="Medium List 2 Accent 4" w:uiPriority="66"/>
-    <w:lsdException w:name="Medium Grid 1 Accent 4" w:uiPriority="67"/>
-    <w:lsdException w:name="Medium Grid 2 Accent 4" w:uiPriority="68"/>
-    <w:lsdException w:name="Medium Grid 3 Accent 4" w:uiPriority="69"/>
-    <w:lsdException w:name="Dark List Accent 4" w:uiPriority="70"/>
-    <w:lsdException w:name="Colorful Shading Accent 4" w:uiPriority="71"/>
-    <w:lsdException w:name="Colorful List Accent 4" w:uiPriority="72"/>
-    <w:lsdException w:name="Colorful Grid Accent 4" w:uiPriority="73"/>
-    <w:lsdException w:name="Light Shading Accent 5" w:uiPriority="60"/>
-    <w:lsdException w:name="Light List Accent 5" w:uiPriority="61"/>
-    <w:lsdException w:name="Light Grid Accent 5" w:uiPriority="62"/>
-    <w:lsdException w:name="Medium Shading 1 Accent 5" w:uiPriority="63"/>
-    <w:lsdException w:name="Medium Shading 2 Accent 5" w:uiPriority="64"/>
-    <w:lsdException w:name="Medium List 1 Accent 5" w:uiPriority="65"/>
-    <w:lsdException w:name="Medium List 2 Accent 5" w:uiPriority="66"/>
-    <w:lsdException w:name="Medium Grid 1 Accent 5" w:uiPriority="67"/>
-    <w:lsdException w:name="Medium Grid 2 Accent 5" w:uiPriority="68"/>
-    <w:lsdException w:name="Medium Grid 3 Accent 5" w:uiPriority="69"/>
-    <w:lsdException w:name="Dark List Accent 5" w:uiPriority="70"/>
-    <w:lsdException w:name="Colorful Shading Accent 5" w:uiPriority="71"/>
-    <w:lsdException w:name="Colorful List Accent 5" w:uiPriority="72"/>
-    <w:lsdException w:name="Colorful Grid Accent 5" w:uiPriority="73"/>
-    <w:lsdException w:name="Light Shading Accent 6" w:uiPriority="60"/>
-    <w:lsdException w:name="Light List Accent 6" w:uiPriority="61"/>
-    <w:lsdException w:name="Light Grid Accent 6" w:uiPriority="62"/>
-    <w:lsdException w:name="Medium Shading 1 Accent 6" w:uiPriority="63"/>
-    <w:lsdException w:name="Medium Shading 2 Accent 6" w:uiPriority="64"/>
-    <w:lsdException w:name="Medium List 1 Accent 6" w:uiPriority="65"/>
-    <w:lsdException w:name="Medium List 2 Accent 6" w:uiPriority="66"/>
-    <w:lsdException w:name="Medium Grid 1 Accent 6" w:uiPriority="67"/>
-    <w:lsdException w:name="Medium Grid 2 Accent 6" w:uiPriority="68"/>
-    <w:lsdException w:name="Medium Grid 3 Accent 6" w:uiPriority="69"/>
-    <w:lsdException w:name="Dark List Accent 6" w:uiPriority="70"/>
-    <w:lsdException w:name="Colorful Shading Accent 6" w:uiPriority="71"/>
-    <w:lsdException w:name="Colorful List Accent 6" w:uiPriority="72"/>
-    <w:lsdException w:name="Colorful Grid Accent 6" w:uiPriority="73"/>
-    <w:lsdException w:name="Subtle Emphasis" w:uiPriority="19" w:qFormat="1"/>
-    <w:lsdException w:name="Intense Emphasis" w:uiPriority="21" w:qFormat="1"/>
-    <w:lsdException w:name="Subtle Reference" w:uiPriority="31" w:qFormat="1"/>
-    <w:lsdException w:name="Intense Reference" w:uiPriority="32" w:qFormat="1"/>
-    <w:lsdException w:name="Book Title" w:uiPriority="33" w:qFormat="1"/>
-    <w:lsdException w:name="Bibliography" w:semiHidden="1" w:uiPriority="37" w:unhideWhenUsed="1"/>
-    <w:lsdException w:name="TOC Heading" w:semiHidden="1" w:uiPriority="39" w:unhideWhenUsed="1" w:qFormat="1"/>
-    <w:lsdException w:name="Plain Table 1" w:uiPriority="41"/>
-    <w:lsdException w:name="Plain Table 2" w:uiPriority="42"/>
-    <w:lsdException w:name="Plain Table 3" w:uiPriority="43"/>
-    <w:lsdException w:name="Plain Table 4" w:uiPriority="44"/>
-    <w:lsdException w:name="Plain Table 5" w:uiPriority="45"/>
-    <w:lsdException w:name="Grid Table Light" w:uiPriority="40"/>
-    <w:lsdException w:name="Grid Table 1 Light" w:uiPriority="46"/>
-    <w:lsdException w:name="Grid Table 2" w:uiPriority="47"/>
-    <w:lsdException w:name="Grid Table 3" w:uiPriority="48"/>
-    <w:lsdException w:name="Grid Table 4" w:uiPriority="49"/>
-    <w:lsdException w:name="Grid Table 5 Dark" w:uiPriority="50"/>
-    <w:lsdException w:name="Grid Table 6 Colorful" w:uiPriority="51"/>
-    <w:lsdException w:name="Grid Table 7 Colorful" w:uiPriority="52"/>
-    <w:lsdException w:name="Grid Table 1 Light Accent 1" w:uiPriority="46"/>
-    <w:lsdException w:name="Grid Table 2 Accent 1" w:uiPriority="47"/>
-    <w:lsdException w:name="Grid Table 3 Accent 1" w:uiPriority="48"/>
-    <w:lsdException w:name="Grid Table 4 Accent 1" w:uiPriority="49"/>
-    <w:lsdException w:name="Grid Table 5 Dark Accent 1" w:uiPriority="50"/>
-    <w:lsdException w:name="Grid Table 6 Colorful Accent 1" w:uiPriority="51"/>
-    <w:lsdException w:name="Grid Table 7 Colorful Accent 1" w:uiPriority="52"/>
-    <w:lsdException w:name="Grid Table 1 Light Accent 2" w:uiPriority="46"/>
-    <w:lsdException w:name="Grid Table 2 Accent 2" w:uiPriority="47"/>
-    <w:lsdException w:name="Grid Table 3 Accent 2" w:uiPriority="48"/>
-    <w:lsdException w:name="Grid Table 4 Accent 2" w:uiPriority="49"/>
-    <w:lsdException w:name="Grid Table 5 Dark Accent 2" w:uiPriority="50"/>
-    <w:lsdException w:name="Grid Table 6 Colorful Accent 2" w:uiPriority="51"/>
-    <w:lsdException w:name="Grid Table 7 Colorful Accent 2" w:uiPriority="52"/>
-    <w:lsdException w:name="Grid Table 1 Light Accent 3" w:uiPriority="46"/>
-    <w:lsdException w:name="Grid Table 2 Accent 3" w:uiPriority="47"/>
-    <w:lsdException w:name="Grid Table 3 Accent 3" w:uiPriority="48"/>
-    <w:lsdException w:name="Grid Table 4 Accent 3" w:uiPriority="49"/>
-    <w:lsdException w:name="Grid Table 5 Dark Accent 3" w:uiPriority="50"/>
-    <w:lsdException w:name="Grid Table 6 Colorful Accent 3" w:uiPriority="51"/>
-    <w:lsdException w:name="Grid Table 7 Colorful Accent 3" w:uiPriority="52"/>
-    <w:lsdException w:name="Grid Table 1 Light Accent 4" w:uiPriority="46"/>
-    <w:lsdException w:name="Grid Table 2 Accent 4" w:uiPriority="47"/>
-    <w:lsdException w:name="Grid Table 3 Accent 4" w:uiPriority="48"/>
-    <w:lsdException w:name="Grid Table 4 Accent 4" w:uiPriority="49"/>
-    <w:lsdException w:name="Grid Table 5 Dark Accent 4" w:uiPriority="50"/>
-    <w:lsdException w:name="Grid Table 6 Colorful Accent 4" w:uiPriority="51"/>
-    <w:lsdException w:name="Grid Table 7 Colorful Accent 4" w:uiPriority="52"/>
-    <w:lsdException w:name="Grid Table 1 Light Accent 5" w:uiPriority="46"/>
-    <w:lsdException w:name="Grid Table 2 Accent 5" w:uiPriority="47"/>
-    <w:lsdException w:name="Grid Table 3 Accent 5" w:uiPriority="48"/>
-    <w:lsdException w:name="Grid Table 4 Accent 5" w:uiPriority="49"/>
-    <w:lsdException w:name="Grid Table 5 Dark Accent 5" w:uiPriority="50"/>
-    <w:lsdException w:name="Grid Table 6 Colorful Accent 5" w:uiPriority="51"/>
-    <w:lsdException w:name="Grid Table 7 Colorful Accent 5" w:uiPriority="52"/>
-    <w:lsdException w:name="Grid Table 1 Light Accent 6" w:uiPriority="46"/>
-    <w:lsdException w:name="Grid Table 2 Accent 6" w:uiPriority="47"/>
-    <w:lsdException w:name="Grid Table 3 Accent 6" w:uiPriority="48"/>
-    <w:lsdException w:name="Grid Table 4 Accent 6" w:uiPriority="49"/>
-    <w:lsdException w:name="Grid Table 5 Dark Accent 6" w:uiPriority="50"/>
-    <w:lsdException w:name="Grid Table 6 Colorful Accent 6" w:uiPriority="51"/>
-    <w:lsdException w:name="Grid Table 7 Colorful Accent 6" w:uiPriority="52"/>
-    <w:lsdException w:name="List Table 1 Light" w:uiPriority="46"/>
-    <w:lsdException w:name="List Table 2" w:uiPriority="47"/>
-    <w:lsdException w:name="List Table 3" w:uiPriority="48"/>
-    <w:lsdException w:name="List Table 4" w:uiPriority="49"/>
-    <w:lsdException w:name="List Table 5 Dark" w:uiPriority="50"/>
-    <w:lsdException w:name="List Table 6 Colorful" w:uiPriority="51"/>
-    <w:lsdException w:name="List Table 7 Colorful" w:uiPriority="52"/>
-    <w:lsdException w:name="List Table 1 Light Accent 1" w:uiPriority="46"/>
-    <w:lsdException w:name="List Table 2 Accent 1" w:uiPriority="47"/>
-    <w:lsdException w:name="List Table 3 Accent 1" w:uiPriority="48"/>
-    <w:lsdException w:name="List Table 4 Accent 1" w:uiPriority="49"/>
-    <w:lsdException w:name="List Table 5 Dark Accent 1" w:uiPriority="50"/>
-    <w:lsdException w:name="List Table 6 Colorful Accent 1" w:uiPriority="51"/>
-    <w:lsdException w:name="List Table 7 Colorful Accent 1" w:uiPriority="52"/>
-    <w:lsdException w:name="List Table 1 Light Accent 2" w:uiPriority="46"/>
-    <w:lsdException w:name="List Table 2 Accent 2" w:uiPriority="47"/>
-    <w:lsdException w:name="List Table 3 Accent 2" w:uiPriority="48"/>
-    <w:lsdException w:name="List Table 4 Accent 2" w:uiPriority="49"/>
-    <w:lsdException w:name="List Table 5 Dark Accent 2" w:uiPriority="50"/>
-    <w:lsdException w:name="List Table 6 Colorful Accent 2" w:uiPriority="51"/>
-    <w:lsdException w:name="List Table 7 Colorful Accent 2" w:uiPriority="52"/>
-    <w:lsdException w:name="List Table 1 Light Accent 3" w:uiPriority="46"/>
-    <w:lsdException w:name="List Table 2 Accent 3" w:uiPriority="47"/>
-    <w:lsdException w:name="List Table 3 Accent 3" w:uiPriority="48"/>
-    <w:lsdException w:name="List Table 4 Accent 3" w:uiPriority="49"/>
-    <w:lsdException w:name="List Table 5 Dark Accent 3" w:uiPriority="50"/>
-    <w:lsdException w:name="List Table 6 Colorful Accent 3" w:uiPriority="51"/>
-    <w:lsdException w:name="List Table 7 Colorful Accent 3" w:uiPriority="52"/>
-    <w:lsdException w:name="List Table 1 Light Accent 4" w:uiPriority="46"/>
-    <w:lsdException w:name="List Table 2 Accent 4" w:uiPriority="47"/>
-    <w:lsdException w:name="List Table 3 Accent 4" w:uiPriority="48"/>
-    <w:lsdException w:name="List Table 4 Accent 4" w:uiPriority="49"/>
-    <w:lsdException w:name="List Table 5 Dark Accent 4" w:uiPriority="50"/>
-    <w:lsdException w:name="List Table 6 Colorful Accent 4" w:uiPriority="51"/>
-    <w:lsdException w:name="List Table 7 Colorful Accent 4" w:uiPriority="52"/>
-    <w:lsdException w:name="List Table 1 Light Accent 5" w:uiPriority="46"/>
-    <w:lsdException w:name="List Table 2 Accent 5" w:uiPriority="47"/>
-    <w:lsdException w:name="List Table 3 Accent 5" w:uiPriority="48"/>
-    <w:lsdException w:name="List Table 4 Accent 5" w:uiPriority="49"/>
-    <w:lsdException w:name="List Table 5 Dark Accent 5" w:uiPriority="50"/>
-    <w:lsdException w:name="List Table 6 Colorful Accent 5" w:uiPriority="51"/>
-    <w:lsdException w:name="List Table 7 Colorful Accent 5" w:uiPriority="52"/>
-    <w:lsdException w:name="List Table 1 Light Accent 6" w:uiPriority="46"/>
-    <w:lsdException w:name="List Table 2 Accent 6" w:uiPriority="47"/>
-    <w:lsdException w:name="List Table 3 Accent 6" w:uiPriority="48"/>
-    <w:lsdException w:name="List Table 4 Accent 6" w:uiPriority="49"/>
-    <w:lsdException w:name="List Table 5 Dark Accent 6" w:uiPriority="50"/>
-    <w:lsdException w:name="List Table 6 Colorful Accent 6" w:uiPriority="51"/>
-    <w:lsdException w:name="List Table 7 Colorful Accent 6" w:uiPriority="52"/>
-  </w:latentStyles>
-  <w:style w:type="paragraph" w:default="1" w:styleId="Normal">
-    <w:name w:val="Normal"/>
-    <w:qFormat/>
-  </w:style>
-  <w:style w:type="character" w:default="1" w:styleId="Fuentedeprrafopredeter">
-    <w:name w:val="Default Paragraph Font"/>
-    <w:uiPriority w:val="1"/>
-    <w:semiHidden/>
-    <w:unhideWhenUsed/>
-  </w:style>
-  <w:style w:type="table" w:default="1" w:styleId="Tablanormal">
-    <w:name w:val="Normal Table"/>
-    <w:uiPriority w:val="99"/>
-    <w:semiHidden/>
-    <w:unhideWhenUsed/>
-    <w:tblPr>
-      <w:tblInd w:w="0" w:type="dxa"/>
-      <w:tblCellMar>
-        <w:top w:w="0" w:type="dxa"/>
-        <w:left w:w="108" w:type="dxa"/>
-        <w:bottom w:w="0" w:type="dxa"/>
-        <w:right w:w="108" w:type="dxa"/>
-      </w:tblCellMar>
-    </w:tblPr>
-  </w:style>
-  <w:style w:type="numbering" w:default="1" w:styleId="Sinlista">
-    <w:name w:val="No List"/>
-    <w:uiPriority w:val="99"/>
-    <w:semiHidden/>
-    <w:unhideWhenUsed/>
-  </w:style>
-</w:styles>
-</file>
-
-<file path=word/glossary/webSettings.xml><?xml version="1.0" encoding="utf-8"?>
-<w:webSettings xmlns:mc="http://schemas.openxmlformats.org/markup-compatibility/2006" xmlns:r="http://schemas.openxmlformats.org/officeDocument/2006/relationships" xmlns:w="http://schemas.openxmlformats.org/wordprocessingml/2006/main" xmlns:w14="http://schemas.microsoft.com/office/word/2010/wordml" xmlns:w15="http://schemas.microsoft.com/office/word/2012/wordml" xmlns:w16se="http://schemas.microsoft.com/office/word/2015/wordml/symex" mc:Ignorable="w14 w15 w16se"/>
 </file>
 
 <file path=word/theme/theme1.xml><?xml version="1.0" encoding="utf-8"?>
@@ -9929,15 +9838,16 @@
 </file>
 
 <file path=customXml/item1.xml><?xml version="1.0" encoding="utf-8"?>
-<?mso-contentType ?>
-<FormTemplates xmlns="http://schemas.microsoft.com/sharepoint/v3/contenttype/forms">
-  <Display>DocumentLibraryForm</Display>
-  <Edit>DocumentLibraryForm</Edit>
-  <New>DocumentLibraryForm</New>
-</FormTemplates>
+<b:Sources xmlns:b="http://schemas.openxmlformats.org/officeDocument/2006/bibliography" xmlns="http://schemas.openxmlformats.org/officeDocument/2006/bibliography" SelectedStyle="\APASixthEditionOfficeOnline.xsl" StyleName="APA" Version="6"/>
 </file>
 
 <file path=customXml/item2.xml><?xml version="1.0" encoding="utf-8"?>
+<p:properties xmlns:p="http://schemas.microsoft.com/office/2006/metadata/properties" xmlns:xsi="http://www.w3.org/2001/XMLSchema-instance" xmlns:pc="http://schemas.microsoft.com/office/infopath/2007/PartnerControls">
+  <documentManagement/>
+</p:properties>
+</file>
+
+<file path=customXml/item3.xml><?xml version="1.0" encoding="utf-8"?>
 <ct:contentTypeSchema xmlns:ct="http://schemas.microsoft.com/office/2006/metadata/contentType" xmlns:ma="http://schemas.microsoft.com/office/2006/metadata/properties/metaAttributes" ct:_="" ma:_="" ma:contentTypeName="Documento" ma:contentTypeID="0x010100E96778489EE7714D8BD12CC105EB918B" ma:contentTypeVersion="2" ma:contentTypeDescription="Crear nuevo documento." ma:contentTypeScope="" ma:versionID="416c5c7ae9b5d54d83875cd3c65194e3">
   <xsd:schema xmlns:xsd="http://www.w3.org/2001/XMLSchema" xmlns:xs="http://www.w3.org/2001/XMLSchema" xmlns:p="http://schemas.microsoft.com/office/2006/metadata/properties" xmlns:ns2="126e8a1c-9ea9-435a-ac89-d06c80d62e30" targetNamespace="http://schemas.microsoft.com/office/2006/metadata/properties" ma:root="true" ma:fieldsID="70a237c842677bd850644f8595079f5e" ns2:_="">
     <xsd:import namespace="126e8a1c-9ea9-435a-ac89-d06c80d62e30"/>
@@ -10069,25 +9979,33 @@
 </ct:contentTypeSchema>
 </file>
 
-<file path=customXml/item3.xml><?xml version="1.0" encoding="utf-8"?>
-<p:properties xmlns:p="http://schemas.microsoft.com/office/2006/metadata/properties" xmlns:xsi="http://www.w3.org/2001/XMLSchema-instance" xmlns:pc="http://schemas.microsoft.com/office/infopath/2007/PartnerControls">
-  <documentManagement/>
-</p:properties>
-</file>
-
 <file path=customXml/item4.xml><?xml version="1.0" encoding="utf-8"?>
-<b:Sources xmlns:b="http://schemas.openxmlformats.org/officeDocument/2006/bibliography" xmlns="http://schemas.openxmlformats.org/officeDocument/2006/bibliography" SelectedStyle="\APASixthEditionOfficeOnline.xsl" StyleName="APA" Version="6"/>
+<?mso-contentType ?>
+<FormTemplates xmlns="http://schemas.microsoft.com/sharepoint/v3/contenttype/forms">
+  <Display>DocumentLibraryForm</Display>
+  <Edit>DocumentLibraryForm</Edit>
+  <New>DocumentLibraryForm</New>
+</FormTemplates>
 </file>
 
 <file path=customXml/itemProps1.xml><?xml version="1.0" encoding="utf-8"?>
-<ds:datastoreItem xmlns:ds="http://schemas.openxmlformats.org/officeDocument/2006/customXml" ds:itemID="{DABAA964-10BA-4DBC-ABF2-CDEAC0FAF7AA}">
+<ds:datastoreItem xmlns:ds="http://schemas.openxmlformats.org/officeDocument/2006/customXml" ds:itemID="{38798A93-35BB-4E36-97F5-7254B21EAFCC}">
   <ds:schemaRefs>
-    <ds:schemaRef ds:uri="http://schemas.microsoft.com/sharepoint/v3/contenttype/forms"/>
+    <ds:schemaRef ds:uri="http://schemas.openxmlformats.org/officeDocument/2006/bibliography"/>
   </ds:schemaRefs>
 </ds:datastoreItem>
 </file>
 
 <file path=customXml/itemProps2.xml><?xml version="1.0" encoding="utf-8"?>
+<ds:datastoreItem xmlns:ds="http://schemas.openxmlformats.org/officeDocument/2006/customXml" ds:itemID="{5F1783E3-BA1C-4CA3-8E32-C9B378BBED03}">
+  <ds:schemaRefs>
+    <ds:schemaRef ds:uri="http://schemas.microsoft.com/office/2006/metadata/properties"/>
+    <ds:schemaRef ds:uri="http://schemas.microsoft.com/office/infopath/2007/PartnerControls"/>
+  </ds:schemaRefs>
+</ds:datastoreItem>
+</file>
+
+<file path=customXml/itemProps3.xml><?xml version="1.0" encoding="utf-8"?>
 <ds:datastoreItem xmlns:ds="http://schemas.openxmlformats.org/officeDocument/2006/customXml" ds:itemID="{90673534-9590-47F8-B0D6-46AB217CB3AD}">
   <ds:schemaRefs>
     <ds:schemaRef ds:uri="http://schemas.microsoft.com/office/2006/metadata/contentType"/>
@@ -10105,26 +10023,10 @@
 </ds:datastoreItem>
 </file>
 
-<file path=customXml/itemProps3.xml><?xml version="1.0" encoding="utf-8"?>
-<ds:datastoreItem xmlns:ds="http://schemas.openxmlformats.org/officeDocument/2006/customXml" ds:itemID="{5F1783E3-BA1C-4CA3-8E32-C9B378BBED03}">
+<file path=customXml/itemProps4.xml><?xml version="1.0" encoding="utf-8"?>
+<ds:datastoreItem xmlns:ds="http://schemas.openxmlformats.org/officeDocument/2006/customXml" ds:itemID="{DABAA964-10BA-4DBC-ABF2-CDEAC0FAF7AA}">
   <ds:schemaRefs>
-    <ds:schemaRef ds:uri="http://purl.org/dc/terms/"/>
-    <ds:schemaRef ds:uri="http://purl.org/dc/dcmitype/"/>
-    <ds:schemaRef ds:uri="http://schemas.microsoft.com/office/2006/metadata/properties"/>
-    <ds:schemaRef ds:uri="http://www.w3.org/XML/1998/namespace"/>
-    <ds:schemaRef ds:uri="http://schemas.microsoft.com/office/2006/documentManagement/types"/>
-    <ds:schemaRef ds:uri="126e8a1c-9ea9-435a-ac89-d06c80d62e30"/>
-    <ds:schemaRef ds:uri="http://purl.org/dc/elements/1.1/"/>
-    <ds:schemaRef ds:uri="http://schemas.microsoft.com/office/infopath/2007/PartnerControls"/>
-    <ds:schemaRef ds:uri="http://schemas.openxmlformats.org/package/2006/metadata/core-properties"/>
-  </ds:schemaRefs>
-</ds:datastoreItem>
-</file>
-
-<file path=customXml/itemProps4.xml><?xml version="1.0" encoding="utf-8"?>
-<ds:datastoreItem xmlns:ds="http://schemas.openxmlformats.org/officeDocument/2006/customXml" ds:itemID="{38798A93-35BB-4E36-97F5-7254B21EAFCC}">
-  <ds:schemaRefs>
-    <ds:schemaRef ds:uri="http://schemas.openxmlformats.org/officeDocument/2006/bibliography"/>
+    <ds:schemaRef ds:uri="http://schemas.microsoft.com/sharepoint/v3/contenttype/forms"/>
   </ds:schemaRefs>
 </ds:datastoreItem>
 </file>
</xml_diff>